<commit_message>
Calificado 1: base de datos reducida (3 sedes, 5 productos, 5 ventas, sin fechas)
Co-Authored-By: Claude Sonnet 5.5 <noreply@anthropic.com>
Claude-Session: https://claude.ai/code/session_01HWf88gfjbnyHET9WH8GMM1
</commit_message>
<xml_diff>
--- a/laboratorios_fgd/LAB-C1-FGD-2026II-ESTUDIANTE.docx
+++ b/laboratorios_fgd/LAB-C1-FGD-2026II-ESTUDIANTE.docx
@@ -8600,7 +8600,7 @@
           <w:sz w:val="22"/>
           <w:szCs w:val="22"/>
         </w:rPr>
-        <w:t xml:space="preserve">  Usted es analista de datos de El Buen Sabor, un restaurante con sedes en Lima, Arequipa, Trujillo y Cusco. La administradora le entrega 72 ventas simuladas del 1 al 6 de marzo de 2026 y le pide evaluar si conviene lanzar una promoción. Antes de consultar nada, debe entender cómo está organizada la base de datos. Las cifras son didácticas y no describen una tendencia real.</w:t>
+        <w:t xml:space="preserve">  Usted es analista de datos de El Buen Sabor, un restaurante con sedes en Lima, Cusco y Juliaca. La administradora le entrega una base pequeña con 5 ventas simuladas y le pide evaluar si conviene lanzar una promoción. Antes de consultar nada, debe entender cómo está organizada la base de datos. Las cifras son didácticas y no describen una tendencia real.</w:t>
       </w:r>
     </w:p>
     <w:p>
@@ -8626,7 +8626,7 @@
         <w:t xml:space="preserve">crean y llenan la base de datos SQLite</w:t>
       </w:r>
       <w:r>
-        <w:t xml:space="preserve"> con tres tablas: sedes, productos y ventas. Luego ejecute la celda 5, que muestra las primeras filas de cada tabla, y complete las tablas 5.1 a 5.3 leyendo la estructura en el código de la celda 3. En SQLite un valor booleano se guarda como entero: 1 (sí) o 0 (no).</w:t>
+        <w:t xml:space="preserve"> con tres tablas: sedes, productos y ventas. Luego ejecute la celda 5, que muestra el contenido de cada tabla, y complete las tablas 5.1 a 5.3 leyendo la estructura en el código de la celda 3. En SQLite un valor booleano se guarda como entero: 1 (sí) o 0 (no).</w:t>
       </w:r>
     </w:p>
     <w:p>
@@ -8747,7 +8747,7 @@
           <w:sz w:val="18"/>
           <w:szCs w:val="18"/>
         </w:rPr>
-        <w:t xml:space="preserve">    sede_id        INTEGER PRIMARY KEY,</w:t>
+        <w:t xml:space="preserve">    sede_id   INTEGER PRIMARY KEY,</w:t>
       </w:r>
     </w:p>
     <w:p>
@@ -8762,7 +8762,7 @@
           <w:sz w:val="18"/>
           <w:szCs w:val="18"/>
         </w:rPr>
-        <w:t xml:space="preserve">    ciudad         TEXT    NOT NULL,</w:t>
+        <w:t xml:space="preserve">    ciudad    TEXT    NOT NULL,</w:t>
       </w:r>
     </w:p>
     <w:p>
@@ -8777,7 +8777,7 @@
           <w:sz w:val="18"/>
           <w:szCs w:val="18"/>
         </w:rPr>
-        <w:t xml:space="preserve">    es_propia      INTEGER NOT NULL,   -- 1 = sí, 0 = no</w:t>
+        <w:t xml:space="preserve">    es_propia INTEGER NOT NULL      -- 1 = sí, 0 = no</w:t>
       </w:r>
     </w:p>
     <w:p>
@@ -8792,7 +8792,7 @@
           <w:sz w:val="18"/>
           <w:szCs w:val="18"/>
         </w:rPr>
-        <w:t xml:space="preserve">    fecha_apertura TEXT    NOT NULL</w:t>
+        <w:t xml:space="preserve">);</w:t>
       </w:r>
     </w:p>
     <w:p>
@@ -8807,7 +8807,7 @@
           <w:sz w:val="18"/>
           <w:szCs w:val="18"/>
         </w:rPr>
-        <w:t xml:space="preserve">);</w:t>
+        <w:t xml:space="preserve"> </w:t>
       </w:r>
     </w:p>
     <w:p>
@@ -8822,7 +8822,7 @@
           <w:sz w:val="18"/>
           <w:szCs w:val="18"/>
         </w:rPr>
-        <w:t xml:space="preserve"> </w:t>
+        <w:t xml:space="preserve">CREATE TABLE productos (</w:t>
       </w:r>
     </w:p>
     <w:p>
@@ -8837,7 +8837,7 @@
           <w:sz w:val="18"/>
           <w:szCs w:val="18"/>
         </w:rPr>
-        <w:t xml:space="preserve">CREATE TABLE productos (</w:t>
+        <w:t xml:space="preserve">    producto_id  INTEGER PRIMARY KEY,</w:t>
       </w:r>
     </w:p>
     <w:p>
@@ -8852,7 +8852,7 @@
           <w:sz w:val="18"/>
           <w:szCs w:val="18"/>
         </w:rPr>
-        <w:t xml:space="preserve">    producto_id  INTEGER PRIMARY KEY,</w:t>
+        <w:t xml:space="preserve">    nombre       TEXT    NOT NULL,</w:t>
       </w:r>
     </w:p>
     <w:p>
@@ -8867,7 +8867,7 @@
           <w:sz w:val="18"/>
           <w:szCs w:val="18"/>
         </w:rPr>
-        <w:t xml:space="preserve">    nombre       TEXT    NOT NULL,</w:t>
+        <w:t xml:space="preserve">    categoria    TEXT    NOT NULL,</w:t>
       </w:r>
     </w:p>
     <w:p>
@@ -8882,7 +8882,7 @@
           <w:sz w:val="18"/>
           <w:szCs w:val="18"/>
         </w:rPr>
-        <w:t xml:space="preserve">    categoria    TEXT    NOT NULL,</w:t>
+        <w:t xml:space="preserve">    precio_lista REAL    NOT NULL,</w:t>
       </w:r>
     </w:p>
     <w:p>
@@ -8897,7 +8897,7 @@
           <w:sz w:val="18"/>
           <w:szCs w:val="18"/>
         </w:rPr>
-        <w:t xml:space="preserve">    precio_lista REAL    NOT NULL,</w:t>
+        <w:t xml:space="preserve">    activo       INTEGER NOT NULL   -- 1 = sí, 0 = no</w:t>
       </w:r>
     </w:p>
     <w:p>
@@ -8912,7 +8912,7 @@
           <w:sz w:val="18"/>
           <w:szCs w:val="18"/>
         </w:rPr>
-        <w:t xml:space="preserve">    activo       INTEGER NOT NULL      -- 1 = sí, 0 = no</w:t>
+        <w:t xml:space="preserve">);</w:t>
       </w:r>
     </w:p>
     <w:p>
@@ -8927,7 +8927,7 @@
           <w:sz w:val="18"/>
           <w:szCs w:val="18"/>
         </w:rPr>
-        <w:t xml:space="preserve">);</w:t>
+        <w:t xml:space="preserve"> </w:t>
       </w:r>
     </w:p>
     <w:p>
@@ -8942,7 +8942,7 @@
           <w:sz w:val="18"/>
           <w:szCs w:val="18"/>
         </w:rPr>
-        <w:t xml:space="preserve"> </w:t>
+        <w:t xml:space="preserve">CREATE TABLE ventas (</w:t>
       </w:r>
     </w:p>
     <w:p>
@@ -8957,7 +8957,7 @@
           <w:sz w:val="18"/>
           <w:szCs w:val="18"/>
         </w:rPr>
-        <w:t xml:space="preserve">CREATE TABLE ventas (</w:t>
+        <w:t xml:space="preserve">    venta_id         INTEGER PRIMARY KEY,</w:t>
       </w:r>
     </w:p>
     <w:p>
@@ -8972,7 +8972,7 @@
           <w:sz w:val="18"/>
           <w:szCs w:val="18"/>
         </w:rPr>
-        <w:t xml:space="preserve">    venta_id         INTEGER PRIMARY KEY,</w:t>
+        <w:t xml:space="preserve">    ciudad           TEXT    NOT NULL,</w:t>
       </w:r>
     </w:p>
     <w:p>
@@ -8987,7 +8987,7 @@
           <w:sz w:val="18"/>
           <w:szCs w:val="18"/>
         </w:rPr>
-        <w:t xml:space="preserve">    fecha_venta      TEXT    NOT NULL,</w:t>
+        <w:t xml:space="preserve">    producto         TEXT    NOT NULL,</w:t>
       </w:r>
     </w:p>
     <w:p>
@@ -9002,7 +9002,7 @@
           <w:sz w:val="18"/>
           <w:szCs w:val="18"/>
         </w:rPr>
-        <w:t xml:space="preserve">    ciudad           TEXT    NOT NULL,</w:t>
+        <w:t xml:space="preserve">    categoria        TEXT    NOT NULL,</w:t>
       </w:r>
     </w:p>
     <w:p>
@@ -9017,7 +9017,7 @@
           <w:sz w:val="18"/>
           <w:szCs w:val="18"/>
         </w:rPr>
-        <w:t xml:space="preserve">    producto         TEXT    NOT NULL,</w:t>
+        <w:t xml:space="preserve">    unidades         INTEGER NOT NULL,</w:t>
       </w:r>
     </w:p>
     <w:p>
@@ -9032,7 +9032,7 @@
           <w:sz w:val="18"/>
           <w:szCs w:val="18"/>
         </w:rPr>
-        <w:t xml:space="preserve">    categoria        TEXT    NOT NULL,</w:t>
+        <w:t xml:space="preserve">    monto            REAL    NOT NULL,</w:t>
       </w:r>
     </w:p>
     <w:p>
@@ -9047,7 +9047,7 @@
           <w:sz w:val="18"/>
           <w:szCs w:val="18"/>
         </w:rPr>
-        <w:t xml:space="preserve">    unidades         INTEGER NOT NULL,</w:t>
+        <w:t xml:space="preserve">    pago_con_tarjeta INTEGER NOT NULL,  -- 1 = sí, 0 = no</w:t>
       </w:r>
     </w:p>
     <w:p>
@@ -9062,37 +9062,7 @@
           <w:sz w:val="18"/>
           <w:szCs w:val="18"/>
         </w:rPr>
-        <w:t xml:space="preserve">    monto            REAL    NOT NULL,</w:t>
-      </w:r>
-    </w:p>
-    <w:p>
-      <w:pPr>
-        <w:keepNext/>
-        <w:shd w:fill="F5F5F5" w:val="clear"/>
-        <w:spacing w:after="0" w:before="0" w:line="240"/>
-      </w:pPr>
-      <w:r>
-        <w:rPr>
-          <w:rFonts w:ascii="Consolas" w:cs="Consolas" w:eastAsia="Consolas" w:hAnsi="Consolas"/>
-          <w:sz w:val="18"/>
-          <w:szCs w:val="18"/>
-        </w:rPr>
-        <w:t xml:space="preserve">    pago_con_tarjeta INTEGER NOT NULL, -- 1 = sí, 0 = no</w:t>
-      </w:r>
-    </w:p>
-    <w:p>
-      <w:pPr>
-        <w:keepNext/>
-        <w:shd w:fill="F5F5F5" w:val="clear"/>
-        <w:spacing w:after="0" w:before="0" w:line="240"/>
-      </w:pPr>
-      <w:r>
-        <w:rPr>
-          <w:rFonts w:ascii="Consolas" w:cs="Consolas" w:eastAsia="Consolas" w:hAnsi="Consolas"/>
-          <w:sz w:val="18"/>
-          <w:szCs w:val="18"/>
-        </w:rPr>
-        <w:t xml:space="preserve">    satisfaccion     TEXT              -- Baja, Media o Alta (puede quedar vacía)</w:t>
+        <w:t xml:space="preserve">    satisfaccion     TEXT               -- Baja, Media o Alta (puede quedar vacía)</w:t>
       </w:r>
     </w:p>
     <w:p>
@@ -9188,7 +9158,7 @@
           <w:sz w:val="18"/>
           <w:szCs w:val="18"/>
         </w:rPr>
-        <w:t xml:space="preserve">    (1, 'Lima', 1, '2019-03-15'),</w:t>
+        <w:t xml:space="preserve">    (1, 'Lima', 1),</w:t>
       </w:r>
     </w:p>
     <w:p>
@@ -9203,7 +9173,7 @@
           <w:sz w:val="18"/>
           <w:szCs w:val="18"/>
         </w:rPr>
-        <w:t xml:space="preserve">    (2, 'Arequipa', 1, '2020-08-01'),</w:t>
+        <w:t xml:space="preserve">    (2, 'Cusco', 0),</w:t>
       </w:r>
     </w:p>
     <w:p>
@@ -9218,7 +9188,7 @@
           <w:sz w:val="18"/>
           <w:szCs w:val="18"/>
         </w:rPr>
-        <w:t xml:space="preserve">    (3, 'Trujillo', 0, '2021-05-10'),</w:t>
+        <w:t xml:space="preserve">    (3, 'Juliaca', 0);</w:t>
       </w:r>
     </w:p>
     <w:p>
@@ -9233,7 +9203,7 @@
           <w:sz w:val="18"/>
           <w:szCs w:val="18"/>
         </w:rPr>
-        <w:t xml:space="preserve">    (4, 'Cusco', 0, '2022-01-20');</w:t>
+        <w:t xml:space="preserve"> </w:t>
       </w:r>
     </w:p>
     <w:p>
@@ -9248,7 +9218,7 @@
           <w:sz w:val="18"/>
           <w:szCs w:val="18"/>
         </w:rPr>
-        <w:t xml:space="preserve"> </w:t>
+        <w:t xml:space="preserve">INSERT INTO productos VALUES</w:t>
       </w:r>
     </w:p>
     <w:p>
@@ -9263,7 +9233,7 @@
           <w:sz w:val="18"/>
           <w:szCs w:val="18"/>
         </w:rPr>
-        <w:t xml:space="preserve">INSERT INTO productos VALUES</w:t>
+        <w:t xml:space="preserve">    (1, 'Lomo saltado', 'Plato', 38.0, 1),</w:t>
       </w:r>
     </w:p>
     <w:p>
@@ -9278,7 +9248,7 @@
           <w:sz w:val="18"/>
           <w:szCs w:val="18"/>
         </w:rPr>
-        <w:t xml:space="preserve">    (1, 'Lomo saltado', 'Plato', 38.0, 1),</w:t>
+        <w:t xml:space="preserve">    (2, 'Ceviche', 'Plato', 42.0, 1),</w:t>
       </w:r>
     </w:p>
     <w:p>
@@ -9293,7 +9263,7 @@
           <w:sz w:val="18"/>
           <w:szCs w:val="18"/>
         </w:rPr>
-        <w:t xml:space="preserve">    (2, 'Ají de gallina', 'Plato', 32.0, 1),</w:t>
+        <w:t xml:space="preserve">    (3, 'Chicha morada', 'Bebida', 9.0, 1),</w:t>
       </w:r>
     </w:p>
     <w:p>
@@ -9308,7 +9278,7 @@
           <w:sz w:val="18"/>
           <w:szCs w:val="18"/>
         </w:rPr>
-        <w:t xml:space="preserve">    (3, 'Arroz con pollo', 'Plato', 28.0, 1),</w:t>
+        <w:t xml:space="preserve">    (4, 'Limonada', 'Bebida', 8.0, 1),</w:t>
       </w:r>
     </w:p>
     <w:p>
@@ -9323,7 +9293,7 @@
           <w:sz w:val="18"/>
           <w:szCs w:val="18"/>
         </w:rPr>
-        <w:t xml:space="preserve">    (4, 'Ceviche', 'Plato', 42.0, 1),</w:t>
+        <w:t xml:space="preserve">    (5, 'Suspiro limeño', 'Postre', 15.0, 0);</w:t>
       </w:r>
     </w:p>
     <w:p>
@@ -9338,7 +9308,7 @@
           <w:sz w:val="18"/>
           <w:szCs w:val="18"/>
         </w:rPr>
-        <w:t xml:space="preserve">    (5, 'Tallarines verdes', 'Plato', 27.0, 1),</w:t>
+        <w:t xml:space="preserve"> </w:t>
       </w:r>
     </w:p>
     <w:p>
@@ -9353,7 +9323,7 @@
           <w:sz w:val="18"/>
           <w:szCs w:val="18"/>
         </w:rPr>
-        <w:t xml:space="preserve">    (6, 'Pollo a la plancha', 'Plato', 33.0, 1),</w:t>
+        <w:t xml:space="preserve">INSERT INTO ventas VALUES</w:t>
       </w:r>
     </w:p>
     <w:p>
@@ -9368,7 +9338,7 @@
           <w:sz w:val="18"/>
           <w:szCs w:val="18"/>
         </w:rPr>
-        <w:t xml:space="preserve">    (7, 'Chicha morada', 'Bebida', 9.0, 1),</w:t>
+        <w:t xml:space="preserve">    (1, 'Lima', 'Lomo saltado', 'Plato', 2, 76.0, 1, 'Alta'),</w:t>
       </w:r>
     </w:p>
     <w:p>
@@ -9383,7 +9353,7 @@
           <w:sz w:val="18"/>
           <w:szCs w:val="18"/>
         </w:rPr>
-        <w:t xml:space="preserve">    (8, 'Limonada', 'Bebida', 8.0, 1),</w:t>
+        <w:t xml:space="preserve">    (2, 'Cusco', 'Ceviche', 'Plato', 3, 126.0, 1, 'Media'),</w:t>
       </w:r>
     </w:p>
     <w:p>
@@ -9398,7 +9368,7 @@
           <w:sz w:val="18"/>
           <w:szCs w:val="18"/>
         </w:rPr>
-        <w:t xml:space="preserve">    (9, 'Jugo de maracuyá', 'Bebida', 11.0, 1),</w:t>
+        <w:t xml:space="preserve">    (3, 'Juliaca', 'Chicha morada', 'Bebida', 2, 18.0, 0, 'Baja'),</w:t>
       </w:r>
     </w:p>
     <w:p>
@@ -9413,7 +9383,7 @@
           <w:sz w:val="18"/>
           <w:szCs w:val="18"/>
         </w:rPr>
-        <w:t xml:space="preserve">    (10, 'Agua', 'Bebida', 6.0, 1),</w:t>
+        <w:t xml:space="preserve">    (4, 'Lima', 'Limonada', 'Bebida', 3, 24.0, 0, NULL),</w:t>
       </w:r>
     </w:p>
     <w:p>
@@ -9428,1132 +9398,7 @@
           <w:sz w:val="18"/>
           <w:szCs w:val="18"/>
         </w:rPr>
-        <w:t xml:space="preserve">    (11, 'Suspiro limeño', 'Postre', 15.0, 1),</w:t>
-      </w:r>
-    </w:p>
-    <w:p>
-      <w:pPr>
-        <w:keepNext/>
-        <w:shd w:fill="F5F5F5" w:val="clear"/>
-        <w:spacing w:after="0" w:before="0" w:line="240"/>
-      </w:pPr>
-      <w:r>
-        <w:rPr>
-          <w:rFonts w:ascii="Consolas" w:cs="Consolas" w:eastAsia="Consolas" w:hAnsi="Consolas"/>
-          <w:sz w:val="18"/>
-          <w:szCs w:val="18"/>
-        </w:rPr>
-        <w:t xml:space="preserve">    (12, 'Mazamorra morada', 'Postre', 12.0, 0);</w:t>
-      </w:r>
-    </w:p>
-    <w:p>
-      <w:pPr>
-        <w:keepNext/>
-        <w:shd w:fill="F5F5F5" w:val="clear"/>
-        <w:spacing w:after="0" w:before="0" w:line="240"/>
-      </w:pPr>
-      <w:r>
-        <w:rPr>
-          <w:rFonts w:ascii="Consolas" w:cs="Consolas" w:eastAsia="Consolas" w:hAnsi="Consolas"/>
-          <w:sz w:val="18"/>
-          <w:szCs w:val="18"/>
-        </w:rPr>
-        <w:t xml:space="preserve"> </w:t>
-      </w:r>
-    </w:p>
-    <w:p>
-      <w:pPr>
-        <w:keepNext/>
-        <w:shd w:fill="F5F5F5" w:val="clear"/>
-        <w:spacing w:after="0" w:before="0" w:line="240"/>
-      </w:pPr>
-      <w:r>
-        <w:rPr>
-          <w:rFonts w:ascii="Consolas" w:cs="Consolas" w:eastAsia="Consolas" w:hAnsi="Consolas"/>
-          <w:sz w:val="18"/>
-          <w:szCs w:val="18"/>
-        </w:rPr>
-        <w:t xml:space="preserve">INSERT INTO ventas VALUES</w:t>
-      </w:r>
-    </w:p>
-    <w:p>
-      <w:pPr>
-        <w:keepNext/>
-        <w:shd w:fill="F5F5F5" w:val="clear"/>
-        <w:spacing w:after="0" w:before="0" w:line="240"/>
-      </w:pPr>
-      <w:r>
-        <w:rPr>
-          <w:rFonts w:ascii="Consolas" w:cs="Consolas" w:eastAsia="Consolas" w:hAnsi="Consolas"/>
-          <w:sz w:val="18"/>
-          <w:szCs w:val="18"/>
-        </w:rPr>
-        <w:t xml:space="preserve">    (1, '2026-03-01', 'Arequipa', 'Lomo saltado', 'Plato', 2, 76.0, 1, 'Baja'),</w:t>
-      </w:r>
-    </w:p>
-    <w:p>
-      <w:pPr>
-        <w:keepNext/>
-        <w:shd w:fill="F5F5F5" w:val="clear"/>
-        <w:spacing w:after="0" w:before="0" w:line="240"/>
-      </w:pPr>
-      <w:r>
-        <w:rPr>
-          <w:rFonts w:ascii="Consolas" w:cs="Consolas" w:eastAsia="Consolas" w:hAnsi="Consolas"/>
-          <w:sz w:val="18"/>
-          <w:szCs w:val="18"/>
-        </w:rPr>
-        <w:t xml:space="preserve">    (2, '2026-03-01', 'Trujillo', 'Ají de gallina', 'Plato', 3, 96.0, 1, 'Media'),</w:t>
-      </w:r>
-    </w:p>
-    <w:p>
-      <w:pPr>
-        <w:keepNext/>
-        <w:shd w:fill="F5F5F5" w:val="clear"/>
-        <w:spacing w:after="0" w:before="0" w:line="240"/>
-      </w:pPr>
-      <w:r>
-        <w:rPr>
-          <w:rFonts w:ascii="Consolas" w:cs="Consolas" w:eastAsia="Consolas" w:hAnsi="Consolas"/>
-          <w:sz w:val="18"/>
-          <w:szCs w:val="18"/>
-        </w:rPr>
-        <w:t xml:space="preserve">    (3, '2026-03-01', 'Cusco', 'Arroz con pollo', 'Plato', 1, 28.0, 0, 'Alta'),</w:t>
-      </w:r>
-    </w:p>
-    <w:p>
-      <w:pPr>
-        <w:keepNext/>
-        <w:shd w:fill="F5F5F5" w:val="clear"/>
-        <w:spacing w:after="0" w:before="0" w:line="240"/>
-      </w:pPr>
-      <w:r>
-        <w:rPr>
-          <w:rFonts w:ascii="Consolas" w:cs="Consolas" w:eastAsia="Consolas" w:hAnsi="Consolas"/>
-          <w:sz w:val="18"/>
-          <w:szCs w:val="18"/>
-        </w:rPr>
-        <w:t xml:space="preserve">    (4, '2026-03-01', 'Lima', 'Ceviche', 'Plato', 2, 84.0, 1, 'Baja'),</w:t>
-      </w:r>
-    </w:p>
-    <w:p>
-      <w:pPr>
-        <w:keepNext/>
-        <w:shd w:fill="F5F5F5" w:val="clear"/>
-        <w:spacing w:after="0" w:before="0" w:line="240"/>
-      </w:pPr>
-      <w:r>
-        <w:rPr>
-          <w:rFonts w:ascii="Consolas" w:cs="Consolas" w:eastAsia="Consolas" w:hAnsi="Consolas"/>
-          <w:sz w:val="18"/>
-          <w:szCs w:val="18"/>
-        </w:rPr>
-        <w:t xml:space="preserve">    (5, '2026-03-01', 'Arequipa', 'Tallarines verdes', 'Plato', 3, 81.0, 1, 'Media'),</w:t>
-      </w:r>
-    </w:p>
-    <w:p>
-      <w:pPr>
-        <w:keepNext/>
-        <w:shd w:fill="F5F5F5" w:val="clear"/>
-        <w:spacing w:after="0" w:before="0" w:line="240"/>
-      </w:pPr>
-      <w:r>
-        <w:rPr>
-          <w:rFonts w:ascii="Consolas" w:cs="Consolas" w:eastAsia="Consolas" w:hAnsi="Consolas"/>
-          <w:sz w:val="18"/>
-          <w:szCs w:val="18"/>
-        </w:rPr>
-        <w:t xml:space="preserve">    (6, '2026-03-01', 'Trujillo', 'Pollo a la plancha', 'Plato', 1, 33.0, 0, 'Alta'),</w:t>
-      </w:r>
-    </w:p>
-    <w:p>
-      <w:pPr>
-        <w:keepNext/>
-        <w:shd w:fill="F5F5F5" w:val="clear"/>
-        <w:spacing w:after="0" w:before="0" w:line="240"/>
-      </w:pPr>
-      <w:r>
-        <w:rPr>
-          <w:rFonts w:ascii="Consolas" w:cs="Consolas" w:eastAsia="Consolas" w:hAnsi="Consolas"/>
-          <w:sz w:val="18"/>
-          <w:szCs w:val="18"/>
-        </w:rPr>
-        <w:t xml:space="preserve">    (7, '2026-03-01', 'Cusco', 'Chicha morada', 'Bebida', 2, 18.0, 0, 'Baja'),</w:t>
-      </w:r>
-    </w:p>
-    <w:p>
-      <w:pPr>
-        <w:keepNext/>
-        <w:shd w:fill="F5F5F5" w:val="clear"/>
-        <w:spacing w:after="0" w:before="0" w:line="240"/>
-      </w:pPr>
-      <w:r>
-        <w:rPr>
-          <w:rFonts w:ascii="Consolas" w:cs="Consolas" w:eastAsia="Consolas" w:hAnsi="Consolas"/>
-          <w:sz w:val="18"/>
-          <w:szCs w:val="18"/>
-        </w:rPr>
-        <w:t xml:space="preserve">    (8, '2026-03-01', 'Lima', 'Limonada', 'Bebida', 3, 24.0, 0, 'Media'),</w:t>
-      </w:r>
-    </w:p>
-    <w:p>
-      <w:pPr>
-        <w:keepNext/>
-        <w:shd w:fill="F5F5F5" w:val="clear"/>
-        <w:spacing w:after="0" w:before="0" w:line="240"/>
-      </w:pPr>
-      <w:r>
-        <w:rPr>
-          <w:rFonts w:ascii="Consolas" w:cs="Consolas" w:eastAsia="Consolas" w:hAnsi="Consolas"/>
-          <w:sz w:val="18"/>
-          <w:szCs w:val="18"/>
-        </w:rPr>
-        <w:t xml:space="preserve">    (9, '2026-03-01', 'Arequipa', 'Jugo de maracuyá', 'Bebida', 1, 11.0, 0, NULL),</w:t>
-      </w:r>
-    </w:p>
-    <w:p>
-      <w:pPr>
-        <w:keepNext/>
-        <w:shd w:fill="F5F5F5" w:val="clear"/>
-        <w:spacing w:after="0" w:before="0" w:line="240"/>
-      </w:pPr>
-      <w:r>
-        <w:rPr>
-          <w:rFonts w:ascii="Consolas" w:cs="Consolas" w:eastAsia="Consolas" w:hAnsi="Consolas"/>
-          <w:sz w:val="18"/>
-          <w:szCs w:val="18"/>
-        </w:rPr>
-        <w:t xml:space="preserve">    (10, '2026-03-01', 'Trujillo', 'Agua', 'Bebida', 2, 12.0, 0, 'Baja'),</w:t>
-      </w:r>
-    </w:p>
-    <w:p>
-      <w:pPr>
-        <w:keepNext/>
-        <w:shd w:fill="F5F5F5" w:val="clear"/>
-        <w:spacing w:after="0" w:before="0" w:line="240"/>
-      </w:pPr>
-      <w:r>
-        <w:rPr>
-          <w:rFonts w:ascii="Consolas" w:cs="Consolas" w:eastAsia="Consolas" w:hAnsi="Consolas"/>
-          <w:sz w:val="18"/>
-          <w:szCs w:val="18"/>
-        </w:rPr>
-        <w:t xml:space="preserve">    (11, '2026-03-01', 'Cusco', 'Suspiro limeño', 'Postre', 3, 45.0, 0, 'Media'),</w:t>
-      </w:r>
-    </w:p>
-    <w:p>
-      <w:pPr>
-        <w:keepNext/>
-        <w:shd w:fill="F5F5F5" w:val="clear"/>
-        <w:spacing w:after="0" w:before="0" w:line="240"/>
-      </w:pPr>
-      <w:r>
-        <w:rPr>
-          <w:rFonts w:ascii="Consolas" w:cs="Consolas" w:eastAsia="Consolas" w:hAnsi="Consolas"/>
-          <w:sz w:val="18"/>
-          <w:szCs w:val="18"/>
-        </w:rPr>
-        <w:t xml:space="preserve">    (12, '2026-03-01', 'Lima', 'Mazamorra morada', 'Postre', 1, 12.0, 0, 'Alta'),</w:t>
-      </w:r>
-    </w:p>
-    <w:p>
-      <w:pPr>
-        <w:keepNext/>
-        <w:shd w:fill="F5F5F5" w:val="clear"/>
-        <w:spacing w:after="0" w:before="0" w:line="240"/>
-      </w:pPr>
-      <w:r>
-        <w:rPr>
-          <w:rFonts w:ascii="Consolas" w:cs="Consolas" w:eastAsia="Consolas" w:hAnsi="Consolas"/>
-          <w:sz w:val="18"/>
-          <w:szCs w:val="18"/>
-        </w:rPr>
-        <w:t xml:space="preserve">    (13, '2026-03-02', 'Trujillo', 'Lomo saltado', 'Plato', 3, 114.0, 1, 'Baja'),</w:t>
-      </w:r>
-    </w:p>
-    <w:p>
-      <w:pPr>
-        <w:keepNext/>
-        <w:shd w:fill="F5F5F5" w:val="clear"/>
-        <w:spacing w:after="0" w:before="0" w:line="240"/>
-      </w:pPr>
-      <w:r>
-        <w:rPr>
-          <w:rFonts w:ascii="Consolas" w:cs="Consolas" w:eastAsia="Consolas" w:hAnsi="Consolas"/>
-          <w:sz w:val="18"/>
-          <w:szCs w:val="18"/>
-        </w:rPr>
-        <w:t xml:space="preserve">    (14, '2026-03-02', 'Cusco', 'Ají de gallina', 'Plato', 1, 32.0, 0, 'Alta'),</w:t>
-      </w:r>
-    </w:p>
-    <w:p>
-      <w:pPr>
-        <w:keepNext/>
-        <w:shd w:fill="F5F5F5" w:val="clear"/>
-        <w:spacing w:after="0" w:before="0" w:line="240"/>
-      </w:pPr>
-      <w:r>
-        <w:rPr>
-          <w:rFonts w:ascii="Consolas" w:cs="Consolas" w:eastAsia="Consolas" w:hAnsi="Consolas"/>
-          <w:sz w:val="18"/>
-          <w:szCs w:val="18"/>
-        </w:rPr>
-        <w:t xml:space="preserve">    (15, '2026-03-02', 'Lima', 'Arroz con pollo', 'Plato', 2, 56.0, 1, 'Media'),</w:t>
-      </w:r>
-    </w:p>
-    <w:p>
-      <w:pPr>
-        <w:keepNext/>
-        <w:shd w:fill="F5F5F5" w:val="clear"/>
-        <w:spacing w:after="0" w:before="0" w:line="240"/>
-      </w:pPr>
-      <w:r>
-        <w:rPr>
-          <w:rFonts w:ascii="Consolas" w:cs="Consolas" w:eastAsia="Consolas" w:hAnsi="Consolas"/>
-          <w:sz w:val="18"/>
-          <w:szCs w:val="18"/>
-        </w:rPr>
-        <w:t xml:space="preserve">    (16, '2026-03-02', 'Arequipa', 'Ceviche', 'Plato', 3, 126.0, 1, 'Baja'),</w:t>
-      </w:r>
-    </w:p>
-    <w:p>
-      <w:pPr>
-        <w:keepNext/>
-        <w:shd w:fill="F5F5F5" w:val="clear"/>
-        <w:spacing w:after="0" w:before="0" w:line="240"/>
-      </w:pPr>
-      <w:r>
-        <w:rPr>
-          <w:rFonts w:ascii="Consolas" w:cs="Consolas" w:eastAsia="Consolas" w:hAnsi="Consolas"/>
-          <w:sz w:val="18"/>
-          <w:szCs w:val="18"/>
-        </w:rPr>
-        <w:t xml:space="preserve">    (17, '2026-03-02', 'Trujillo', 'Tallarines verdes', 'Plato', 1, 27.0, 0, 'Alta'),</w:t>
-      </w:r>
-    </w:p>
-    <w:p>
-      <w:pPr>
-        <w:keepNext/>
-        <w:shd w:fill="F5F5F5" w:val="clear"/>
-        <w:spacing w:after="0" w:before="0" w:line="240"/>
-      </w:pPr>
-      <w:r>
-        <w:rPr>
-          <w:rFonts w:ascii="Consolas" w:cs="Consolas" w:eastAsia="Consolas" w:hAnsi="Consolas"/>
-          <w:sz w:val="18"/>
-          <w:szCs w:val="18"/>
-        </w:rPr>
-        <w:t xml:space="preserve">    (18, '2026-03-02', 'Cusco', 'Pollo a la plancha', 'Plato', 2, 66.0, 1, 'Media'),</w:t>
-      </w:r>
-    </w:p>
-    <w:p>
-      <w:pPr>
-        <w:keepNext/>
-        <w:shd w:fill="F5F5F5" w:val="clear"/>
-        <w:spacing w:after="0" w:before="0" w:line="240"/>
-      </w:pPr>
-      <w:r>
-        <w:rPr>
-          <w:rFonts w:ascii="Consolas" w:cs="Consolas" w:eastAsia="Consolas" w:hAnsi="Consolas"/>
-          <w:sz w:val="18"/>
-          <w:szCs w:val="18"/>
-        </w:rPr>
-        <w:t xml:space="preserve">    (19, '2026-03-02', 'Lima', 'Chicha morada', 'Bebida', 3, 27.0, 0, 'Baja'),</w:t>
-      </w:r>
-    </w:p>
-    <w:p>
-      <w:pPr>
-        <w:keepNext/>
-        <w:shd w:fill="F5F5F5" w:val="clear"/>
-        <w:spacing w:after="0" w:before="0" w:line="240"/>
-      </w:pPr>
-      <w:r>
-        <w:rPr>
-          <w:rFonts w:ascii="Consolas" w:cs="Consolas" w:eastAsia="Consolas" w:hAnsi="Consolas"/>
-          <w:sz w:val="18"/>
-          <w:szCs w:val="18"/>
-        </w:rPr>
-        <w:t xml:space="preserve">    (20, '2026-03-02', 'Arequipa', 'Limonada', 'Bebida', 1, 8.0, 0, NULL),</w:t>
-      </w:r>
-    </w:p>
-    <w:p>
-      <w:pPr>
-        <w:keepNext/>
-        <w:shd w:fill="F5F5F5" w:val="clear"/>
-        <w:spacing w:after="0" w:before="0" w:line="240"/>
-      </w:pPr>
-      <w:r>
-        <w:rPr>
-          <w:rFonts w:ascii="Consolas" w:cs="Consolas" w:eastAsia="Consolas" w:hAnsi="Consolas"/>
-          <w:sz w:val="18"/>
-          <w:szCs w:val="18"/>
-        </w:rPr>
-        <w:t xml:space="preserve">    (21, '2026-03-02', 'Trujillo', 'Jugo de maracuyá', 'Bebida', 2, 22.0, 0, 'Media'),</w:t>
-      </w:r>
-    </w:p>
-    <w:p>
-      <w:pPr>
-        <w:keepNext/>
-        <w:shd w:fill="F5F5F5" w:val="clear"/>
-        <w:spacing w:after="0" w:before="0" w:line="240"/>
-      </w:pPr>
-      <w:r>
-        <w:rPr>
-          <w:rFonts w:ascii="Consolas" w:cs="Consolas" w:eastAsia="Consolas" w:hAnsi="Consolas"/>
-          <w:sz w:val="18"/>
-          <w:szCs w:val="18"/>
-        </w:rPr>
-        <w:t xml:space="preserve">    (22, '2026-03-02', 'Cusco', 'Agua', 'Bebida', 3, 18.0, 0, 'Baja'),</w:t>
-      </w:r>
-    </w:p>
-    <w:p>
-      <w:pPr>
-        <w:keepNext/>
-        <w:shd w:fill="F5F5F5" w:val="clear"/>
-        <w:spacing w:after="0" w:before="0" w:line="240"/>
-      </w:pPr>
-      <w:r>
-        <w:rPr>
-          <w:rFonts w:ascii="Consolas" w:cs="Consolas" w:eastAsia="Consolas" w:hAnsi="Consolas"/>
-          <w:sz w:val="18"/>
-          <w:szCs w:val="18"/>
-        </w:rPr>
-        <w:t xml:space="preserve">    (23, '2026-03-02', 'Lima', 'Suspiro limeño', 'Postre', 1, 15.0, 0, 'Alta'),</w:t>
-      </w:r>
-    </w:p>
-    <w:p>
-      <w:pPr>
-        <w:keepNext/>
-        <w:shd w:fill="F5F5F5" w:val="clear"/>
-        <w:spacing w:after="0" w:before="0" w:line="240"/>
-      </w:pPr>
-      <w:r>
-        <w:rPr>
-          <w:rFonts w:ascii="Consolas" w:cs="Consolas" w:eastAsia="Consolas" w:hAnsi="Consolas"/>
-          <w:sz w:val="18"/>
-          <w:szCs w:val="18"/>
-        </w:rPr>
-        <w:t xml:space="preserve">    (24, '2026-03-02', 'Arequipa', 'Mazamorra morada', 'Postre', 2, 24.0, 0, 'Media'),</w:t>
-      </w:r>
-    </w:p>
-    <w:p>
-      <w:pPr>
-        <w:keepNext/>
-        <w:shd w:fill="F5F5F5" w:val="clear"/>
-        <w:spacing w:after="0" w:before="0" w:line="240"/>
-      </w:pPr>
-      <w:r>
-        <w:rPr>
-          <w:rFonts w:ascii="Consolas" w:cs="Consolas" w:eastAsia="Consolas" w:hAnsi="Consolas"/>
-          <w:sz w:val="18"/>
-          <w:szCs w:val="18"/>
-        </w:rPr>
-        <w:t xml:space="preserve">    (25, '2026-03-03', 'Cusco', 'Lomo saltado', 'Plato', 1, 38.0, 0, 'Baja'),</w:t>
-      </w:r>
-    </w:p>
-    <w:p>
-      <w:pPr>
-        <w:keepNext/>
-        <w:shd w:fill="F5F5F5" w:val="clear"/>
-        <w:spacing w:after="0" w:before="0" w:line="240"/>
-      </w:pPr>
-      <w:r>
-        <w:rPr>
-          <w:rFonts w:ascii="Consolas" w:cs="Consolas" w:eastAsia="Consolas" w:hAnsi="Consolas"/>
-          <w:sz w:val="18"/>
-          <w:szCs w:val="18"/>
-        </w:rPr>
-        <w:t xml:space="preserve">    (26, '2026-03-03', 'Lima', 'Ají de gallina', 'Plato', 2, 64.0, 1, 'Baja'),</w:t>
-      </w:r>
-    </w:p>
-    <w:p>
-      <w:pPr>
-        <w:keepNext/>
-        <w:shd w:fill="F5F5F5" w:val="clear"/>
-        <w:spacing w:after="0" w:before="0" w:line="240"/>
-      </w:pPr>
-      <w:r>
-        <w:rPr>
-          <w:rFonts w:ascii="Consolas" w:cs="Consolas" w:eastAsia="Consolas" w:hAnsi="Consolas"/>
-          <w:sz w:val="18"/>
-          <w:szCs w:val="18"/>
-        </w:rPr>
-        <w:t xml:space="preserve">    (27, '2026-03-03', 'Arequipa', 'Arroz con pollo', 'Plato', 3, 84.0, 1, 'Baja'),</w:t>
-      </w:r>
-    </w:p>
-    <w:p>
-      <w:pPr>
-        <w:keepNext/>
-        <w:shd w:fill="F5F5F5" w:val="clear"/>
-        <w:spacing w:after="0" w:before="0" w:line="240"/>
-      </w:pPr>
-      <w:r>
-        <w:rPr>
-          <w:rFonts w:ascii="Consolas" w:cs="Consolas" w:eastAsia="Consolas" w:hAnsi="Consolas"/>
-          <w:sz w:val="18"/>
-          <w:szCs w:val="18"/>
-        </w:rPr>
-        <w:t xml:space="preserve">    (28, '2026-03-03', 'Trujillo', 'Ceviche', 'Plato', 1, 42.0, 0, 'Baja'),</w:t>
-      </w:r>
-    </w:p>
-    <w:p>
-      <w:pPr>
-        <w:keepNext/>
-        <w:shd w:fill="F5F5F5" w:val="clear"/>
-        <w:spacing w:after="0" w:before="0" w:line="240"/>
-      </w:pPr>
-      <w:r>
-        <w:rPr>
-          <w:rFonts w:ascii="Consolas" w:cs="Consolas" w:eastAsia="Consolas" w:hAnsi="Consolas"/>
-          <w:sz w:val="18"/>
-          <w:szCs w:val="18"/>
-        </w:rPr>
-        <w:t xml:space="preserve">    (29, '2026-03-03', 'Cusco', 'Tallarines verdes', 'Plato', 2, 54.0, 1, 'Baja'),</w:t>
-      </w:r>
-    </w:p>
-    <w:p>
-      <w:pPr>
-        <w:keepNext/>
-        <w:shd w:fill="F5F5F5" w:val="clear"/>
-        <w:spacing w:after="0" w:before="0" w:line="240"/>
-      </w:pPr>
-      <w:r>
-        <w:rPr>
-          <w:rFonts w:ascii="Consolas" w:cs="Consolas" w:eastAsia="Consolas" w:hAnsi="Consolas"/>
-          <w:sz w:val="18"/>
-          <w:szCs w:val="18"/>
-        </w:rPr>
-        <w:t xml:space="preserve">    (30, '2026-03-03', 'Lima', 'Pollo a la plancha', 'Plato', 3, 99.0, 1, 'Baja'),</w:t>
-      </w:r>
-    </w:p>
-    <w:p>
-      <w:pPr>
-        <w:keepNext/>
-        <w:shd w:fill="F5F5F5" w:val="clear"/>
-        <w:spacing w:after="0" w:before="0" w:line="240"/>
-      </w:pPr>
-      <w:r>
-        <w:rPr>
-          <w:rFonts w:ascii="Consolas" w:cs="Consolas" w:eastAsia="Consolas" w:hAnsi="Consolas"/>
-          <w:sz w:val="18"/>
-          <w:szCs w:val="18"/>
-        </w:rPr>
-        <w:t xml:space="preserve">    (31, '2026-03-03', 'Arequipa', 'Chicha morada', 'Bebida', 1, 9.0, 0, NULL),</w:t>
-      </w:r>
-    </w:p>
-    <w:p>
-      <w:pPr>
-        <w:keepNext/>
-        <w:shd w:fill="F5F5F5" w:val="clear"/>
-        <w:spacing w:after="0" w:before="0" w:line="240"/>
-      </w:pPr>
-      <w:r>
-        <w:rPr>
-          <w:rFonts w:ascii="Consolas" w:cs="Consolas" w:eastAsia="Consolas" w:hAnsi="Consolas"/>
-          <w:sz w:val="18"/>
-          <w:szCs w:val="18"/>
-        </w:rPr>
-        <w:t xml:space="preserve">    (32, '2026-03-03', 'Trujillo', 'Limonada', 'Bebida', 2, 16.0, 0, 'Baja'),</w:t>
-      </w:r>
-    </w:p>
-    <w:p>
-      <w:pPr>
-        <w:keepNext/>
-        <w:shd w:fill="F5F5F5" w:val="clear"/>
-        <w:spacing w:after="0" w:before="0" w:line="240"/>
-      </w:pPr>
-      <w:r>
-        <w:rPr>
-          <w:rFonts w:ascii="Consolas" w:cs="Consolas" w:eastAsia="Consolas" w:hAnsi="Consolas"/>
-          <w:sz w:val="18"/>
-          <w:szCs w:val="18"/>
-        </w:rPr>
-        <w:t xml:space="preserve">    (33, '2026-03-03', 'Cusco', 'Jugo de maracuyá', 'Bebida', 3, 33.0, 0, 'Baja'),</w:t>
-      </w:r>
-    </w:p>
-    <w:p>
-      <w:pPr>
-        <w:keepNext/>
-        <w:shd w:fill="F5F5F5" w:val="clear"/>
-        <w:spacing w:after="0" w:before="0" w:line="240"/>
-      </w:pPr>
-      <w:r>
-        <w:rPr>
-          <w:rFonts w:ascii="Consolas" w:cs="Consolas" w:eastAsia="Consolas" w:hAnsi="Consolas"/>
-          <w:sz w:val="18"/>
-          <w:szCs w:val="18"/>
-        </w:rPr>
-        <w:t xml:space="preserve">    (34, '2026-03-03', 'Lima', 'Agua', 'Bebida', 1, 6.0, 0, 'Baja'),</w:t>
-      </w:r>
-    </w:p>
-    <w:p>
-      <w:pPr>
-        <w:keepNext/>
-        <w:shd w:fill="F5F5F5" w:val="clear"/>
-        <w:spacing w:after="0" w:before="0" w:line="240"/>
-      </w:pPr>
-      <w:r>
-        <w:rPr>
-          <w:rFonts w:ascii="Consolas" w:cs="Consolas" w:eastAsia="Consolas" w:hAnsi="Consolas"/>
-          <w:sz w:val="18"/>
-          <w:szCs w:val="18"/>
-        </w:rPr>
-        <w:t xml:space="preserve">    (35, '2026-03-03', 'Arequipa', 'Suspiro limeño', 'Postre', 2, 30.0, 0, 'Baja'),</w:t>
-      </w:r>
-    </w:p>
-    <w:p>
-      <w:pPr>
-        <w:keepNext/>
-        <w:shd w:fill="F5F5F5" w:val="clear"/>
-        <w:spacing w:after="0" w:before="0" w:line="240"/>
-      </w:pPr>
-      <w:r>
-        <w:rPr>
-          <w:rFonts w:ascii="Consolas" w:cs="Consolas" w:eastAsia="Consolas" w:hAnsi="Consolas"/>
-          <w:sz w:val="18"/>
-          <w:szCs w:val="18"/>
-        </w:rPr>
-        <w:t xml:space="preserve">    (36, '2026-03-03', 'Trujillo', 'Mazamorra morada', 'Postre', 3, 36.0, 0, 'Baja'),</w:t>
-      </w:r>
-    </w:p>
-    <w:p>
-      <w:pPr>
-        <w:keepNext/>
-        <w:shd w:fill="F5F5F5" w:val="clear"/>
-        <w:spacing w:after="0" w:before="0" w:line="240"/>
-      </w:pPr>
-      <w:r>
-        <w:rPr>
-          <w:rFonts w:ascii="Consolas" w:cs="Consolas" w:eastAsia="Consolas" w:hAnsi="Consolas"/>
-          <w:sz w:val="18"/>
-          <w:szCs w:val="18"/>
-        </w:rPr>
-        <w:t xml:space="preserve">    (37, '2026-03-04', 'Lima', 'Lomo saltado', 'Plato', 2, 76.0, 1, 'Baja'),</w:t>
-      </w:r>
-    </w:p>
-    <w:p>
-      <w:pPr>
-        <w:keepNext/>
-        <w:shd w:fill="F5F5F5" w:val="clear"/>
-        <w:spacing w:after="0" w:before="0" w:line="240"/>
-      </w:pPr>
-      <w:r>
-        <w:rPr>
-          <w:rFonts w:ascii="Consolas" w:cs="Consolas" w:eastAsia="Consolas" w:hAnsi="Consolas"/>
-          <w:sz w:val="18"/>
-          <w:szCs w:val="18"/>
-        </w:rPr>
-        <w:t xml:space="preserve">    (38, '2026-03-04', 'Arequipa', 'Ají de gallina', 'Plato', 3, 96.0, 1, 'Media'),</w:t>
-      </w:r>
-    </w:p>
-    <w:p>
-      <w:pPr>
-        <w:keepNext/>
-        <w:shd w:fill="F5F5F5" w:val="clear"/>
-        <w:spacing w:after="0" w:before="0" w:line="240"/>
-      </w:pPr>
-      <w:r>
-        <w:rPr>
-          <w:rFonts w:ascii="Consolas" w:cs="Consolas" w:eastAsia="Consolas" w:hAnsi="Consolas"/>
-          <w:sz w:val="18"/>
-          <w:szCs w:val="18"/>
-        </w:rPr>
-        <w:t xml:space="preserve">    (39, '2026-03-04', 'Trujillo', 'Arroz con pollo', 'Plato', 1, 28.0, 0, 'Alta'),</w:t>
-      </w:r>
-    </w:p>
-    <w:p>
-      <w:pPr>
-        <w:keepNext/>
-        <w:shd w:fill="F5F5F5" w:val="clear"/>
-        <w:spacing w:after="0" w:before="0" w:line="240"/>
-      </w:pPr>
-      <w:r>
-        <w:rPr>
-          <w:rFonts w:ascii="Consolas" w:cs="Consolas" w:eastAsia="Consolas" w:hAnsi="Consolas"/>
-          <w:sz w:val="18"/>
-          <w:szCs w:val="18"/>
-        </w:rPr>
-        <w:t xml:space="preserve">    (40, '2026-03-04', 'Cusco', 'Ceviche', 'Plato', 2, 84.0, 1, 'Baja'),</w:t>
-      </w:r>
-    </w:p>
-    <w:p>
-      <w:pPr>
-        <w:keepNext/>
-        <w:shd w:fill="F5F5F5" w:val="clear"/>
-        <w:spacing w:after="0" w:before="0" w:line="240"/>
-      </w:pPr>
-      <w:r>
-        <w:rPr>
-          <w:rFonts w:ascii="Consolas" w:cs="Consolas" w:eastAsia="Consolas" w:hAnsi="Consolas"/>
-          <w:sz w:val="18"/>
-          <w:szCs w:val="18"/>
-        </w:rPr>
-        <w:t xml:space="preserve">    (41, '2026-03-04', 'Lima', 'Tallarines verdes', 'Plato', 3, 81.0, 1, 'Media'),</w:t>
-      </w:r>
-    </w:p>
-    <w:p>
-      <w:pPr>
-        <w:keepNext/>
-        <w:shd w:fill="F5F5F5" w:val="clear"/>
-        <w:spacing w:after="0" w:before="0" w:line="240"/>
-      </w:pPr>
-      <w:r>
-        <w:rPr>
-          <w:rFonts w:ascii="Consolas" w:cs="Consolas" w:eastAsia="Consolas" w:hAnsi="Consolas"/>
-          <w:sz w:val="18"/>
-          <w:szCs w:val="18"/>
-        </w:rPr>
-        <w:t xml:space="preserve">    (42, '2026-03-04', 'Arequipa', 'Pollo a la plancha', 'Plato', 1, 33.0, 0, NULL),</w:t>
-      </w:r>
-    </w:p>
-    <w:p>
-      <w:pPr>
-        <w:keepNext/>
-        <w:shd w:fill="F5F5F5" w:val="clear"/>
-        <w:spacing w:after="0" w:before="0" w:line="240"/>
-      </w:pPr>
-      <w:r>
-        <w:rPr>
-          <w:rFonts w:ascii="Consolas" w:cs="Consolas" w:eastAsia="Consolas" w:hAnsi="Consolas"/>
-          <w:sz w:val="18"/>
-          <w:szCs w:val="18"/>
-        </w:rPr>
-        <w:t xml:space="preserve">    (43, '2026-03-04', 'Trujillo', 'Chicha morada', 'Bebida', 2, 18.0, 0, 'Baja'),</w:t>
-      </w:r>
-    </w:p>
-    <w:p>
-      <w:pPr>
-        <w:keepNext/>
-        <w:shd w:fill="F5F5F5" w:val="clear"/>
-        <w:spacing w:after="0" w:before="0" w:line="240"/>
-      </w:pPr>
-      <w:r>
-        <w:rPr>
-          <w:rFonts w:ascii="Consolas" w:cs="Consolas" w:eastAsia="Consolas" w:hAnsi="Consolas"/>
-          <w:sz w:val="18"/>
-          <w:szCs w:val="18"/>
-        </w:rPr>
-        <w:t xml:space="preserve">    (44, '2026-03-04', 'Cusco', 'Limonada', 'Bebida', 3, 24.0, 0, 'Media'),</w:t>
-      </w:r>
-    </w:p>
-    <w:p>
-      <w:pPr>
-        <w:keepNext/>
-        <w:shd w:fill="F5F5F5" w:val="clear"/>
-        <w:spacing w:after="0" w:before="0" w:line="240"/>
-      </w:pPr>
-      <w:r>
-        <w:rPr>
-          <w:rFonts w:ascii="Consolas" w:cs="Consolas" w:eastAsia="Consolas" w:hAnsi="Consolas"/>
-          <w:sz w:val="18"/>
-          <w:szCs w:val="18"/>
-        </w:rPr>
-        <w:t xml:space="preserve">    (45, '2026-03-04', 'Lima', 'Jugo de maracuyá', 'Bebida', 1, 11.0, 0, 'Alta'),</w:t>
-      </w:r>
-    </w:p>
-    <w:p>
-      <w:pPr>
-        <w:keepNext/>
-        <w:shd w:fill="F5F5F5" w:val="clear"/>
-        <w:spacing w:after="0" w:before="0" w:line="240"/>
-      </w:pPr>
-      <w:r>
-        <w:rPr>
-          <w:rFonts w:ascii="Consolas" w:cs="Consolas" w:eastAsia="Consolas" w:hAnsi="Consolas"/>
-          <w:sz w:val="18"/>
-          <w:szCs w:val="18"/>
-        </w:rPr>
-        <w:t xml:space="preserve">    (46, '2026-03-04', 'Arequipa', 'Agua', 'Bebida', 2, 12.0, 0, 'Baja'),</w:t>
-      </w:r>
-    </w:p>
-    <w:p>
-      <w:pPr>
-        <w:keepNext/>
-        <w:shd w:fill="F5F5F5" w:val="clear"/>
-        <w:spacing w:after="0" w:before="0" w:line="240"/>
-      </w:pPr>
-      <w:r>
-        <w:rPr>
-          <w:rFonts w:ascii="Consolas" w:cs="Consolas" w:eastAsia="Consolas" w:hAnsi="Consolas"/>
-          <w:sz w:val="18"/>
-          <w:szCs w:val="18"/>
-        </w:rPr>
-        <w:t xml:space="preserve">    (47, '2026-03-04', 'Trujillo', 'Suspiro limeño', 'Postre', 3, 45.0, 0, 'Media'),</w:t>
-      </w:r>
-    </w:p>
-    <w:p>
-      <w:pPr>
-        <w:keepNext/>
-        <w:shd w:fill="F5F5F5" w:val="clear"/>
-        <w:spacing w:after="0" w:before="0" w:line="240"/>
-      </w:pPr>
-      <w:r>
-        <w:rPr>
-          <w:rFonts w:ascii="Consolas" w:cs="Consolas" w:eastAsia="Consolas" w:hAnsi="Consolas"/>
-          <w:sz w:val="18"/>
-          <w:szCs w:val="18"/>
-        </w:rPr>
-        <w:t xml:space="preserve">    (48, '2026-03-04', 'Cusco', 'Mazamorra morada', 'Postre', 1, 12.0, 0, 'Alta'),</w:t>
-      </w:r>
-    </w:p>
-    <w:p>
-      <w:pPr>
-        <w:keepNext/>
-        <w:shd w:fill="F5F5F5" w:val="clear"/>
-        <w:spacing w:after="0" w:before="0" w:line="240"/>
-      </w:pPr>
-      <w:r>
-        <w:rPr>
-          <w:rFonts w:ascii="Consolas" w:cs="Consolas" w:eastAsia="Consolas" w:hAnsi="Consolas"/>
-          <w:sz w:val="18"/>
-          <w:szCs w:val="18"/>
-        </w:rPr>
-        <w:t xml:space="preserve">    (49, '2026-03-05', 'Arequipa', 'Lomo saltado', 'Plato', 3, 114.0, 1, 'Baja'),</w:t>
-      </w:r>
-    </w:p>
-    <w:p>
-      <w:pPr>
-        <w:keepNext/>
-        <w:shd w:fill="F5F5F5" w:val="clear"/>
-        <w:spacing w:after="0" w:before="0" w:line="240"/>
-      </w:pPr>
-      <w:r>
-        <w:rPr>
-          <w:rFonts w:ascii="Consolas" w:cs="Consolas" w:eastAsia="Consolas" w:hAnsi="Consolas"/>
-          <w:sz w:val="18"/>
-          <w:szCs w:val="18"/>
-        </w:rPr>
-        <w:t xml:space="preserve">    (50, '2026-03-05', 'Trujillo', 'Ají de gallina', 'Plato', 1, 32.0, 0, 'Alta'),</w:t>
-      </w:r>
-    </w:p>
-    <w:p>
-      <w:pPr>
-        <w:keepNext/>
-        <w:shd w:fill="F5F5F5" w:val="clear"/>
-        <w:spacing w:after="0" w:before="0" w:line="240"/>
-      </w:pPr>
-      <w:r>
-        <w:rPr>
-          <w:rFonts w:ascii="Consolas" w:cs="Consolas" w:eastAsia="Consolas" w:hAnsi="Consolas"/>
-          <w:sz w:val="18"/>
-          <w:szCs w:val="18"/>
-        </w:rPr>
-        <w:t xml:space="preserve">    (51, '2026-03-05', 'Cusco', 'Arroz con pollo', 'Plato', 2, 56.0, 1, 'Media'),</w:t>
-      </w:r>
-    </w:p>
-    <w:p>
-      <w:pPr>
-        <w:keepNext/>
-        <w:shd w:fill="F5F5F5" w:val="clear"/>
-        <w:spacing w:after="0" w:before="0" w:line="240"/>
-      </w:pPr>
-      <w:r>
-        <w:rPr>
-          <w:rFonts w:ascii="Consolas" w:cs="Consolas" w:eastAsia="Consolas" w:hAnsi="Consolas"/>
-          <w:sz w:val="18"/>
-          <w:szCs w:val="18"/>
-        </w:rPr>
-        <w:t xml:space="preserve">    (52, '2026-03-05', 'Lima', 'Ceviche', 'Plato', 3, 126.0, 1, 'Baja'),</w:t>
-      </w:r>
-    </w:p>
-    <w:p>
-      <w:pPr>
-        <w:keepNext/>
-        <w:shd w:fill="F5F5F5" w:val="clear"/>
-        <w:spacing w:after="0" w:before="0" w:line="240"/>
-      </w:pPr>
-      <w:r>
-        <w:rPr>
-          <w:rFonts w:ascii="Consolas" w:cs="Consolas" w:eastAsia="Consolas" w:hAnsi="Consolas"/>
-          <w:sz w:val="18"/>
-          <w:szCs w:val="18"/>
-        </w:rPr>
-        <w:t xml:space="preserve">    (53, '2026-03-05', 'Arequipa', 'Tallarines verdes', 'Plato', 1, 27.0, 0, NULL),</w:t>
-      </w:r>
-    </w:p>
-    <w:p>
-      <w:pPr>
-        <w:keepNext/>
-        <w:shd w:fill="F5F5F5" w:val="clear"/>
-        <w:spacing w:after="0" w:before="0" w:line="240"/>
-      </w:pPr>
-      <w:r>
-        <w:rPr>
-          <w:rFonts w:ascii="Consolas" w:cs="Consolas" w:eastAsia="Consolas" w:hAnsi="Consolas"/>
-          <w:sz w:val="18"/>
-          <w:szCs w:val="18"/>
-        </w:rPr>
-        <w:t xml:space="preserve">    (54, '2026-03-05', 'Trujillo', 'Pollo a la plancha', 'Plato', 2, 66.0, 1, 'Media'),</w:t>
-      </w:r>
-    </w:p>
-    <w:p>
-      <w:pPr>
-        <w:keepNext/>
-        <w:shd w:fill="F5F5F5" w:val="clear"/>
-        <w:spacing w:after="0" w:before="0" w:line="240"/>
-      </w:pPr>
-      <w:r>
-        <w:rPr>
-          <w:rFonts w:ascii="Consolas" w:cs="Consolas" w:eastAsia="Consolas" w:hAnsi="Consolas"/>
-          <w:sz w:val="18"/>
-          <w:szCs w:val="18"/>
-        </w:rPr>
-        <w:t xml:space="preserve">    (55, '2026-03-05', 'Cusco', 'Chicha morada', 'Bebida', 3, 27.0, 0, 'Baja'),</w:t>
-      </w:r>
-    </w:p>
-    <w:p>
-      <w:pPr>
-        <w:keepNext/>
-        <w:shd w:fill="F5F5F5" w:val="clear"/>
-        <w:spacing w:after="0" w:before="0" w:line="240"/>
-      </w:pPr>
-      <w:r>
-        <w:rPr>
-          <w:rFonts w:ascii="Consolas" w:cs="Consolas" w:eastAsia="Consolas" w:hAnsi="Consolas"/>
-          <w:sz w:val="18"/>
-          <w:szCs w:val="18"/>
-        </w:rPr>
-        <w:t xml:space="preserve">    (56, '2026-03-05', 'Lima', 'Limonada', 'Bebida', 1, 8.0, 0, 'Alta'),</w:t>
-      </w:r>
-    </w:p>
-    <w:p>
-      <w:pPr>
-        <w:keepNext/>
-        <w:shd w:fill="F5F5F5" w:val="clear"/>
-        <w:spacing w:after="0" w:before="0" w:line="240"/>
-      </w:pPr>
-      <w:r>
-        <w:rPr>
-          <w:rFonts w:ascii="Consolas" w:cs="Consolas" w:eastAsia="Consolas" w:hAnsi="Consolas"/>
-          <w:sz w:val="18"/>
-          <w:szCs w:val="18"/>
-        </w:rPr>
-        <w:t xml:space="preserve">    (57, '2026-03-05', 'Arequipa', 'Jugo de maracuyá', 'Bebida', 2, 22.0, 0, 'Media'),</w:t>
-      </w:r>
-    </w:p>
-    <w:p>
-      <w:pPr>
-        <w:keepNext/>
-        <w:shd w:fill="F5F5F5" w:val="clear"/>
-        <w:spacing w:after="0" w:before="0" w:line="240"/>
-      </w:pPr>
-      <w:r>
-        <w:rPr>
-          <w:rFonts w:ascii="Consolas" w:cs="Consolas" w:eastAsia="Consolas" w:hAnsi="Consolas"/>
-          <w:sz w:val="18"/>
-          <w:szCs w:val="18"/>
-        </w:rPr>
-        <w:t xml:space="preserve">    (58, '2026-03-05', 'Trujillo', 'Agua', 'Bebida', 3, 18.0, 0, 'Baja'),</w:t>
-      </w:r>
-    </w:p>
-    <w:p>
-      <w:pPr>
-        <w:keepNext/>
-        <w:shd w:fill="F5F5F5" w:val="clear"/>
-        <w:spacing w:after="0" w:before="0" w:line="240"/>
-      </w:pPr>
-      <w:r>
-        <w:rPr>
-          <w:rFonts w:ascii="Consolas" w:cs="Consolas" w:eastAsia="Consolas" w:hAnsi="Consolas"/>
-          <w:sz w:val="18"/>
-          <w:szCs w:val="18"/>
-        </w:rPr>
-        <w:t xml:space="preserve">    (59, '2026-03-05', 'Cusco', 'Suspiro limeño', 'Postre', 1, 15.0, 0, 'Alta'),</w:t>
-      </w:r>
-    </w:p>
-    <w:p>
-      <w:pPr>
-        <w:keepNext/>
-        <w:shd w:fill="F5F5F5" w:val="clear"/>
-        <w:spacing w:after="0" w:before="0" w:line="240"/>
-      </w:pPr>
-      <w:r>
-        <w:rPr>
-          <w:rFonts w:ascii="Consolas" w:cs="Consolas" w:eastAsia="Consolas" w:hAnsi="Consolas"/>
-          <w:sz w:val="18"/>
-          <w:szCs w:val="18"/>
-        </w:rPr>
-        <w:t xml:space="preserve">    (60, '2026-03-05', 'Lima', 'Mazamorra morada', 'Postre', 2, 24.0, 0, 'Media'),</w:t>
-      </w:r>
-    </w:p>
-    <w:p>
-      <w:pPr>
-        <w:keepNext/>
-        <w:shd w:fill="F5F5F5" w:val="clear"/>
-        <w:spacing w:after="0" w:before="0" w:line="240"/>
-      </w:pPr>
-      <w:r>
-        <w:rPr>
-          <w:rFonts w:ascii="Consolas" w:cs="Consolas" w:eastAsia="Consolas" w:hAnsi="Consolas"/>
-          <w:sz w:val="18"/>
-          <w:szCs w:val="18"/>
-        </w:rPr>
-        <w:t xml:space="preserve">    (61, '2026-03-06', 'Trujillo', 'Lomo saltado', 'Plato', 1, 38.0, 0, 'Baja'),</w:t>
-      </w:r>
-    </w:p>
-    <w:p>
-      <w:pPr>
-        <w:keepNext/>
-        <w:shd w:fill="F5F5F5" w:val="clear"/>
-        <w:spacing w:after="0" w:before="0" w:line="240"/>
-      </w:pPr>
-      <w:r>
-        <w:rPr>
-          <w:rFonts w:ascii="Consolas" w:cs="Consolas" w:eastAsia="Consolas" w:hAnsi="Consolas"/>
-          <w:sz w:val="18"/>
-          <w:szCs w:val="18"/>
-        </w:rPr>
-        <w:t xml:space="preserve">    (62, '2026-03-06', 'Cusco', 'Ají de gallina', 'Plato', 2, 64.0, 1, 'Baja'),</w:t>
-      </w:r>
-    </w:p>
-    <w:p>
-      <w:pPr>
-        <w:keepNext/>
-        <w:shd w:fill="F5F5F5" w:val="clear"/>
-        <w:spacing w:after="0" w:before="0" w:line="240"/>
-      </w:pPr>
-      <w:r>
-        <w:rPr>
-          <w:rFonts w:ascii="Consolas" w:cs="Consolas" w:eastAsia="Consolas" w:hAnsi="Consolas"/>
-          <w:sz w:val="18"/>
-          <w:szCs w:val="18"/>
-        </w:rPr>
-        <w:t xml:space="preserve">    (63, '2026-03-06', 'Lima', 'Arroz con pollo', 'Plato', 3, 84.0, 1, 'Baja'),</w:t>
-      </w:r>
-    </w:p>
-    <w:p>
-      <w:pPr>
-        <w:keepNext/>
-        <w:shd w:fill="F5F5F5" w:val="clear"/>
-        <w:spacing w:after="0" w:before="0" w:line="240"/>
-      </w:pPr>
-      <w:r>
-        <w:rPr>
-          <w:rFonts w:ascii="Consolas" w:cs="Consolas" w:eastAsia="Consolas" w:hAnsi="Consolas"/>
-          <w:sz w:val="18"/>
-          <w:szCs w:val="18"/>
-        </w:rPr>
-        <w:t xml:space="preserve">    (64, '2026-03-06', 'Arequipa', 'Ceviche', 'Plato', 1, 42.0, 0, NULL),</w:t>
-      </w:r>
-    </w:p>
-    <w:p>
-      <w:pPr>
-        <w:keepNext/>
-        <w:shd w:fill="F5F5F5" w:val="clear"/>
-        <w:spacing w:after="0" w:before="0" w:line="240"/>
-      </w:pPr>
-      <w:r>
-        <w:rPr>
-          <w:rFonts w:ascii="Consolas" w:cs="Consolas" w:eastAsia="Consolas" w:hAnsi="Consolas"/>
-          <w:sz w:val="18"/>
-          <w:szCs w:val="18"/>
-        </w:rPr>
-        <w:t xml:space="preserve">    (65, '2026-03-06', 'Trujillo', 'Tallarines verdes', 'Plato', 2, 54.0, 1, 'Baja'),</w:t>
-      </w:r>
-    </w:p>
-    <w:p>
-      <w:pPr>
-        <w:keepNext/>
-        <w:shd w:fill="F5F5F5" w:val="clear"/>
-        <w:spacing w:after="0" w:before="0" w:line="240"/>
-      </w:pPr>
-      <w:r>
-        <w:rPr>
-          <w:rFonts w:ascii="Consolas" w:cs="Consolas" w:eastAsia="Consolas" w:hAnsi="Consolas"/>
-          <w:sz w:val="18"/>
-          <w:szCs w:val="18"/>
-        </w:rPr>
-        <w:t xml:space="preserve">    (66, '2026-03-06', 'Cusco', 'Pollo a la plancha', 'Plato', 3, 99.0, 1, 'Baja'),</w:t>
-      </w:r>
-    </w:p>
-    <w:p>
-      <w:pPr>
-        <w:keepNext/>
-        <w:shd w:fill="F5F5F5" w:val="clear"/>
-        <w:spacing w:after="0" w:before="0" w:line="240"/>
-      </w:pPr>
-      <w:r>
-        <w:rPr>
-          <w:rFonts w:ascii="Consolas" w:cs="Consolas" w:eastAsia="Consolas" w:hAnsi="Consolas"/>
-          <w:sz w:val="18"/>
-          <w:szCs w:val="18"/>
-        </w:rPr>
-        <w:t xml:space="preserve">    (67, '2026-03-06', 'Lima', 'Chicha morada', 'Bebida', 1, 9.0, 0, 'Baja'),</w:t>
-      </w:r>
-    </w:p>
-    <w:p>
-      <w:pPr>
-        <w:keepNext/>
-        <w:shd w:fill="F5F5F5" w:val="clear"/>
-        <w:spacing w:after="0" w:before="0" w:line="240"/>
-      </w:pPr>
-      <w:r>
-        <w:rPr>
-          <w:rFonts w:ascii="Consolas" w:cs="Consolas" w:eastAsia="Consolas" w:hAnsi="Consolas"/>
-          <w:sz w:val="18"/>
-          <w:szCs w:val="18"/>
-        </w:rPr>
-        <w:t xml:space="preserve">    (68, '2026-03-06', 'Arequipa', 'Limonada', 'Bebida', 2, 16.0, 0, 'Baja'),</w:t>
-      </w:r>
-    </w:p>
-    <w:p>
-      <w:pPr>
-        <w:keepNext/>
-        <w:shd w:fill="F5F5F5" w:val="clear"/>
-        <w:spacing w:after="0" w:before="0" w:line="240"/>
-      </w:pPr>
-      <w:r>
-        <w:rPr>
-          <w:rFonts w:ascii="Consolas" w:cs="Consolas" w:eastAsia="Consolas" w:hAnsi="Consolas"/>
-          <w:sz w:val="18"/>
-          <w:szCs w:val="18"/>
-        </w:rPr>
-        <w:t xml:space="preserve">    (69, '2026-03-06', 'Trujillo', 'Jugo de maracuyá', 'Bebida', 3, 33.0, 0, 'Baja'),</w:t>
-      </w:r>
-    </w:p>
-    <w:p>
-      <w:pPr>
-        <w:keepNext/>
-        <w:shd w:fill="F5F5F5" w:val="clear"/>
-        <w:spacing w:after="0" w:before="0" w:line="240"/>
-      </w:pPr>
-      <w:r>
-        <w:rPr>
-          <w:rFonts w:ascii="Consolas" w:cs="Consolas" w:eastAsia="Consolas" w:hAnsi="Consolas"/>
-          <w:sz w:val="18"/>
-          <w:szCs w:val="18"/>
-        </w:rPr>
-        <w:t xml:space="preserve">    (70, '2026-03-06', 'Cusco', 'Agua', 'Bebida', 1, 6.0, 0, 'Baja'),</w:t>
-      </w:r>
-    </w:p>
-    <w:p>
-      <w:pPr>
-        <w:keepNext/>
-        <w:shd w:fill="F5F5F5" w:val="clear"/>
-        <w:spacing w:after="0" w:before="0" w:line="240"/>
-      </w:pPr>
-      <w:r>
-        <w:rPr>
-          <w:rFonts w:ascii="Consolas" w:cs="Consolas" w:eastAsia="Consolas" w:hAnsi="Consolas"/>
-          <w:sz w:val="18"/>
-          <w:szCs w:val="18"/>
-        </w:rPr>
-        <w:t xml:space="preserve">    (71, '2026-03-06', 'Lima', 'Suspiro limeño', 'Postre', 2, 30.0, 0, 'Baja'),</w:t>
-      </w:r>
-    </w:p>
-    <w:p>
-      <w:pPr>
-        <w:keepNext/>
-        <w:shd w:fill="F5F5F5" w:val="clear"/>
-        <w:spacing w:after="0" w:before="0" w:line="240"/>
-      </w:pPr>
-      <w:r>
-        <w:rPr>
-          <w:rFonts w:ascii="Consolas" w:cs="Consolas" w:eastAsia="Consolas" w:hAnsi="Consolas"/>
-          <w:sz w:val="18"/>
-          <w:szCs w:val="18"/>
-        </w:rPr>
-        <w:t xml:space="preserve">    (72, '2026-03-06', 'Arequipa', 'Mazamorra morada', 'Postre', 3, 36.0, 0, 'Baja');</w:t>
+        <w:t xml:space="preserve">    (5, 'Juliaca', 'Lomo saltado', 'Plato', 1, 38.0, 0, 'Alta');</w:t>
       </w:r>
     </w:p>
     <w:p>
@@ -10679,7 +9524,7 @@
           <w:sz w:val="18"/>
           <w:szCs w:val="18"/>
         </w:rPr>
-        <w:t xml:space="preserve">consulta = """SELECT * FROM productos LIMIT 5;"""</w:t>
+        <w:t xml:space="preserve">consulta = """SELECT * FROM productos;"""</w:t>
       </w:r>
     </w:p>
     <w:p>
@@ -10724,7 +9569,7 @@
           <w:sz w:val="18"/>
           <w:szCs w:val="18"/>
         </w:rPr>
-        <w:t xml:space="preserve">consulta = """SELECT * FROM ventas LIMIT 12;"""</w:t>
+        <w:t xml:space="preserve">consulta = """SELECT * FROM ventas;"""</w:t>
       </w:r>
     </w:p>
     <w:p>
@@ -11443,169 +10288,6 @@
           </w:p>
         </w:tc>
       </w:tr>
-      <w:tr>
-        <w:trPr>
-          <w:cantSplit/>
-          <w:trHeight w:val="460" w:hRule="atLeast"/>
-        </w:trPr>
-        <w:tc>
-          <w:tcPr>
-            <w:tcW w:type="dxa" w:w="2100"/>
-            <w:tcBorders>
-              <w:top w:val="single" w:color="auto" w:sz="4"/>
-              <w:left w:val="single" w:color="auto" w:sz="4"/>
-              <w:bottom w:val="single" w:color="auto" w:sz="4"/>
-              <w:right w:val="single" w:color="auto" w:sz="4"/>
-            </w:tcBorders>
-            <w:shd w:fill="FFFFFF" w:color="auto" w:val="clear"/>
-            <w:tcMar>
-              <w:top w:type="dxa" w:w="80"/>
-              <w:left w:type="dxa" w:w="90"/>
-              <w:bottom w:type="dxa" w:w="80"/>
-              <w:right w:type="dxa" w:w="90"/>
-            </w:tcMar>
-            <w:vAlign w:val="top"/>
-          </w:tcPr>
-          <w:p>
-            <w:pPr>
-              <w:spacing w:after="0" w:line="240"/>
-            </w:pPr>
-            <w:r>
-              <w:rPr>
-                <w:b/>
-                <w:bCs/>
-                <w:sz w:val="22"/>
-                <w:szCs w:val="22"/>
-              </w:rPr>
-              <w:t xml:space="preserve">fecha_apertura</w:t>
-            </w:r>
-          </w:p>
-        </w:tc>
-        <w:tc>
-          <w:tcPr>
-            <w:tcW w:type="dxa" w:w="1500"/>
-            <w:tcBorders>
-              <w:top w:val="single" w:color="auto" w:sz="4"/>
-              <w:left w:val="single" w:color="auto" w:sz="4"/>
-              <w:bottom w:val="single" w:color="auto" w:sz="4"/>
-              <w:right w:val="single" w:color="auto" w:sz="4"/>
-            </w:tcBorders>
-            <w:shd w:fill="FFFFFF" w:color="auto" w:val="clear"/>
-            <w:tcMar>
-              <w:top w:type="dxa" w:w="80"/>
-              <w:left w:type="dxa" w:w="90"/>
-              <w:bottom w:type="dxa" w:w="80"/>
-              <w:right w:type="dxa" w:w="90"/>
-            </w:tcMar>
-            <w:vAlign w:val="top"/>
-          </w:tcPr>
-          <w:p>
-            <w:pPr>
-              <w:spacing w:after="0" w:line="240"/>
-            </w:pPr>
-            <w:r>
-              <w:rPr>
-                <w:sz w:val="22"/>
-                <w:szCs w:val="22"/>
-              </w:rPr>
-              <w:t xml:space="preserve"> </w:t>
-            </w:r>
-          </w:p>
-        </w:tc>
-        <w:tc>
-          <w:tcPr>
-            <w:tcW w:type="dxa" w:w="1900"/>
-            <w:tcBorders>
-              <w:top w:val="single" w:color="auto" w:sz="4"/>
-              <w:left w:val="single" w:color="auto" w:sz="4"/>
-              <w:bottom w:val="single" w:color="auto" w:sz="4"/>
-              <w:right w:val="single" w:color="auto" w:sz="4"/>
-            </w:tcBorders>
-            <w:shd w:fill="FFFFFF" w:color="auto" w:val="clear"/>
-            <w:tcMar>
-              <w:top w:type="dxa" w:w="80"/>
-              <w:left w:type="dxa" w:w="90"/>
-              <w:bottom w:type="dxa" w:w="80"/>
-              <w:right w:type="dxa" w:w="90"/>
-            </w:tcMar>
-            <w:vAlign w:val="top"/>
-          </w:tcPr>
-          <w:p>
-            <w:pPr>
-              <w:spacing w:after="0" w:line="240"/>
-            </w:pPr>
-            <w:r>
-              <w:rPr>
-                <w:sz w:val="22"/>
-                <w:szCs w:val="22"/>
-              </w:rPr>
-              <w:t xml:space="preserve"> </w:t>
-            </w:r>
-          </w:p>
-        </w:tc>
-        <w:tc>
-          <w:tcPr>
-            <w:tcW w:type="dxa" w:w="1800"/>
-            <w:tcBorders>
-              <w:top w:val="single" w:color="auto" w:sz="4"/>
-              <w:left w:val="single" w:color="auto" w:sz="4"/>
-              <w:bottom w:val="single" w:color="auto" w:sz="4"/>
-              <w:right w:val="single" w:color="auto" w:sz="4"/>
-            </w:tcBorders>
-            <w:shd w:fill="FFFFFF" w:color="auto" w:val="clear"/>
-            <w:tcMar>
-              <w:top w:type="dxa" w:w="80"/>
-              <w:left w:type="dxa" w:w="90"/>
-              <w:bottom w:type="dxa" w:w="80"/>
-              <w:right w:type="dxa" w:w="90"/>
-            </w:tcMar>
-            <w:vAlign w:val="top"/>
-          </w:tcPr>
-          <w:p>
-            <w:pPr>
-              <w:spacing w:after="0" w:line="240"/>
-            </w:pPr>
-            <w:r>
-              <w:rPr>
-                <w:sz w:val="22"/>
-                <w:szCs w:val="22"/>
-              </w:rPr>
-              <w:t xml:space="preserve"> </w:t>
-            </w:r>
-          </w:p>
-        </w:tc>
-        <w:tc>
-          <w:tcPr>
-            <w:tcW w:type="dxa" w:w="2338"/>
-            <w:tcBorders>
-              <w:top w:val="single" w:color="auto" w:sz="4"/>
-              <w:left w:val="single" w:color="auto" w:sz="4"/>
-              <w:bottom w:val="single" w:color="auto" w:sz="4"/>
-              <w:right w:val="single" w:color="auto" w:sz="4"/>
-            </w:tcBorders>
-            <w:shd w:fill="FFFFFF" w:color="auto" w:val="clear"/>
-            <w:tcMar>
-              <w:top w:type="dxa" w:w="80"/>
-              <w:left w:type="dxa" w:w="90"/>
-              <w:bottom w:type="dxa" w:w="80"/>
-              <w:right w:type="dxa" w:w="90"/>
-            </w:tcMar>
-            <w:vAlign w:val="top"/>
-          </w:tcPr>
-          <w:p>
-            <w:pPr>
-              <w:spacing w:after="0" w:line="240"/>
-            </w:pPr>
-            <w:r>
-              <w:rPr>
-                <w:sz w:val="22"/>
-                <w:szCs w:val="22"/>
-              </w:rPr>
-              <w:t xml:space="preserve"> </w:t>
-            </w:r>
-          </w:p>
-        </w:tc>
-      </w:tr>
     </w:tbl>
     <w:p>
       <w:pPr>
@@ -13044,7 +11726,7 @@
                 <w:sz w:val="22"/>
                 <w:szCs w:val="22"/>
               </w:rPr>
-              <w:t xml:space="preserve">fecha_venta</w:t>
+              <w:t xml:space="preserve">ciudad</w:t>
             </w:r>
           </w:p>
         </w:tc>
@@ -13207,7 +11889,7 @@
                 <w:sz w:val="22"/>
                 <w:szCs w:val="22"/>
               </w:rPr>
-              <w:t xml:space="preserve">ciudad</w:t>
+              <w:t xml:space="preserve">producto</w:t>
             </w:r>
           </w:p>
         </w:tc>
@@ -13370,7 +12052,7 @@
                 <w:sz w:val="22"/>
                 <w:szCs w:val="22"/>
               </w:rPr>
-              <w:t xml:space="preserve">producto</w:t>
+              <w:t xml:space="preserve">categoria</w:t>
             </w:r>
           </w:p>
         </w:tc>
@@ -13533,7 +12215,7 @@
                 <w:sz w:val="22"/>
                 <w:szCs w:val="22"/>
               </w:rPr>
-              <w:t xml:space="preserve">categoria</w:t>
+              <w:t xml:space="preserve">unidades</w:t>
             </w:r>
           </w:p>
         </w:tc>
@@ -13696,7 +12378,7 @@
                 <w:sz w:val="22"/>
                 <w:szCs w:val="22"/>
               </w:rPr>
-              <w:t xml:space="preserve">unidades</w:t>
+              <w:t xml:space="preserve">monto</w:t>
             </w:r>
           </w:p>
         </w:tc>
@@ -13859,7 +12541,7 @@
                 <w:sz w:val="22"/>
                 <w:szCs w:val="22"/>
               </w:rPr>
-              <w:t xml:space="preserve">monto</w:t>
+              <w:t xml:space="preserve">pago_con_tarjeta</w:t>
             </w:r>
           </w:p>
         </w:tc>
@@ -14022,7 +12704,7 @@
                 <w:sz w:val="22"/>
                 <w:szCs w:val="22"/>
               </w:rPr>
-              <w:t xml:space="preserve">pago_con_tarjeta</w:t>
+              <w:t xml:space="preserve">satisfaccion</w:t>
             </w:r>
           </w:p>
         </w:tc>
@@ -14129,169 +12811,6 @@
               <w:right w:val="single" w:color="auto" w:sz="4"/>
             </w:tcBorders>
             <w:shd w:fill="FFFFFF" w:color="auto" w:val="clear"/>
-            <w:tcMar>
-              <w:top w:type="dxa" w:w="80"/>
-              <w:left w:type="dxa" w:w="90"/>
-              <w:bottom w:type="dxa" w:w="80"/>
-              <w:right w:type="dxa" w:w="90"/>
-            </w:tcMar>
-            <w:vAlign w:val="top"/>
-          </w:tcPr>
-          <w:p>
-            <w:pPr>
-              <w:spacing w:after="0" w:line="240"/>
-            </w:pPr>
-            <w:r>
-              <w:rPr>
-                <w:sz w:val="22"/>
-                <w:szCs w:val="22"/>
-              </w:rPr>
-              <w:t xml:space="preserve"> </w:t>
-            </w:r>
-          </w:p>
-        </w:tc>
-      </w:tr>
-      <w:tr>
-        <w:trPr>
-          <w:cantSplit/>
-          <w:trHeight w:val="460" w:hRule="atLeast"/>
-        </w:trPr>
-        <w:tc>
-          <w:tcPr>
-            <w:tcW w:type="dxa" w:w="2100"/>
-            <w:tcBorders>
-              <w:top w:val="single" w:color="auto" w:sz="4"/>
-              <w:left w:val="single" w:color="auto" w:sz="4"/>
-              <w:bottom w:val="single" w:color="auto" w:sz="4"/>
-              <w:right w:val="single" w:color="auto" w:sz="4"/>
-            </w:tcBorders>
-            <w:shd w:fill="F7F9FB" w:color="auto" w:val="clear"/>
-            <w:tcMar>
-              <w:top w:type="dxa" w:w="80"/>
-              <w:left w:type="dxa" w:w="90"/>
-              <w:bottom w:type="dxa" w:w="80"/>
-              <w:right w:type="dxa" w:w="90"/>
-            </w:tcMar>
-            <w:vAlign w:val="top"/>
-          </w:tcPr>
-          <w:p>
-            <w:pPr>
-              <w:spacing w:after="0" w:line="240"/>
-            </w:pPr>
-            <w:r>
-              <w:rPr>
-                <w:b/>
-                <w:bCs/>
-                <w:sz w:val="22"/>
-                <w:szCs w:val="22"/>
-              </w:rPr>
-              <w:t xml:space="preserve">satisfaccion</w:t>
-            </w:r>
-          </w:p>
-        </w:tc>
-        <w:tc>
-          <w:tcPr>
-            <w:tcW w:type="dxa" w:w="1500"/>
-            <w:tcBorders>
-              <w:top w:val="single" w:color="auto" w:sz="4"/>
-              <w:left w:val="single" w:color="auto" w:sz="4"/>
-              <w:bottom w:val="single" w:color="auto" w:sz="4"/>
-              <w:right w:val="single" w:color="auto" w:sz="4"/>
-            </w:tcBorders>
-            <w:shd w:fill="F7F9FB" w:color="auto" w:val="clear"/>
-            <w:tcMar>
-              <w:top w:type="dxa" w:w="80"/>
-              <w:left w:type="dxa" w:w="90"/>
-              <w:bottom w:type="dxa" w:w="80"/>
-              <w:right w:type="dxa" w:w="90"/>
-            </w:tcMar>
-            <w:vAlign w:val="top"/>
-          </w:tcPr>
-          <w:p>
-            <w:pPr>
-              <w:spacing w:after="0" w:line="240"/>
-            </w:pPr>
-            <w:r>
-              <w:rPr>
-                <w:sz w:val="22"/>
-                <w:szCs w:val="22"/>
-              </w:rPr>
-              <w:t xml:space="preserve"> </w:t>
-            </w:r>
-          </w:p>
-        </w:tc>
-        <w:tc>
-          <w:tcPr>
-            <w:tcW w:type="dxa" w:w="1900"/>
-            <w:tcBorders>
-              <w:top w:val="single" w:color="auto" w:sz="4"/>
-              <w:left w:val="single" w:color="auto" w:sz="4"/>
-              <w:bottom w:val="single" w:color="auto" w:sz="4"/>
-              <w:right w:val="single" w:color="auto" w:sz="4"/>
-            </w:tcBorders>
-            <w:shd w:fill="F7F9FB" w:color="auto" w:val="clear"/>
-            <w:tcMar>
-              <w:top w:type="dxa" w:w="80"/>
-              <w:left w:type="dxa" w:w="90"/>
-              <w:bottom w:type="dxa" w:w="80"/>
-              <w:right w:type="dxa" w:w="90"/>
-            </w:tcMar>
-            <w:vAlign w:val="top"/>
-          </w:tcPr>
-          <w:p>
-            <w:pPr>
-              <w:spacing w:after="0" w:line="240"/>
-            </w:pPr>
-            <w:r>
-              <w:rPr>
-                <w:sz w:val="22"/>
-                <w:szCs w:val="22"/>
-              </w:rPr>
-              <w:t xml:space="preserve"> </w:t>
-            </w:r>
-          </w:p>
-        </w:tc>
-        <w:tc>
-          <w:tcPr>
-            <w:tcW w:type="dxa" w:w="1800"/>
-            <w:tcBorders>
-              <w:top w:val="single" w:color="auto" w:sz="4"/>
-              <w:left w:val="single" w:color="auto" w:sz="4"/>
-              <w:bottom w:val="single" w:color="auto" w:sz="4"/>
-              <w:right w:val="single" w:color="auto" w:sz="4"/>
-            </w:tcBorders>
-            <w:shd w:fill="F7F9FB" w:color="auto" w:val="clear"/>
-            <w:tcMar>
-              <w:top w:type="dxa" w:w="80"/>
-              <w:left w:type="dxa" w:w="90"/>
-              <w:bottom w:type="dxa" w:w="80"/>
-              <w:right w:type="dxa" w:w="90"/>
-            </w:tcMar>
-            <w:vAlign w:val="top"/>
-          </w:tcPr>
-          <w:p>
-            <w:pPr>
-              <w:spacing w:after="0" w:line="240"/>
-            </w:pPr>
-            <w:r>
-              <w:rPr>
-                <w:sz w:val="22"/>
-                <w:szCs w:val="22"/>
-              </w:rPr>
-              <w:t xml:space="preserve"> </w:t>
-            </w:r>
-          </w:p>
-        </w:tc>
-        <w:tc>
-          <w:tcPr>
-            <w:tcW w:type="dxa" w:w="2338"/>
-            <w:tcBorders>
-              <w:top w:val="single" w:color="auto" w:sz="4"/>
-              <w:left w:val="single" w:color="auto" w:sz="4"/>
-              <w:bottom w:val="single" w:color="auto" w:sz="4"/>
-              <w:right w:val="single" w:color="auto" w:sz="4"/>
-            </w:tcBorders>
-            <w:shd w:fill="F7F9FB" w:color="auto" w:val="clear"/>
             <w:tcMar>
               <w:top w:type="dxa" w:w="80"/>
               <w:left w:type="dxa" w:w="90"/>
@@ -14674,7 +13193,7 @@
                 <w:sz w:val="22"/>
                 <w:szCs w:val="22"/>
               </w:rPr>
-              <w:t xml:space="preserve">En la Celda 5, la venta 9 muestra None en satisfaccion. ¿Es un error o un dato faltante? ¿Qué dimensión de calidad afecta?</w:t>
+              <w:t xml:space="preserve">En la Celda 5, la venta 4 muestra None en satisfaccion. ¿Es un error o un dato faltante? ¿Qué dimensión de calidad afecta?</w:t>
             </w:r>
           </w:p>
         </w:tc>
@@ -14802,7 +13321,7 @@
         <w:t xml:space="preserve">qué significa el resultado</w:t>
       </w:r>
       <w:r>
-        <w:t xml:space="preserve">. No modifique los 72 registros.</w:t>
+        <w:t xml:space="preserve">. No modifique los registros.</w:t>
       </w:r>
     </w:p>
     <w:p>
@@ -14834,7 +13353,7 @@
         <w:t xml:space="preserve">Pregunta del analista:</w:t>
       </w:r>
       <w:r>
-        <w:t xml:space="preserve"> ¿Qué ventas de Trujillo, de la categoría Plato, fueron de S/ 60 o más? Muéstrelas de mayor a menor.</w:t>
+        <w:t xml:space="preserve"> ¿Qué ventas de la categoría Plato fueron de S/ 50 o más? Muéstrelas de mayor a menor.</w:t>
       </w:r>
     </w:p>
     <w:p>
@@ -14865,7 +13384,7 @@
           <w:sz w:val="18"/>
           <w:szCs w:val="18"/>
         </w:rPr>
-        <w:t xml:space="preserve">consulta = """SELECT producto, ciudad, monto</w:t>
+        <w:t xml:space="preserve">consulta = """SELECT ciudad, producto, monto</w:t>
       </w:r>
     </w:p>
     <w:p>
@@ -14895,7 +13414,7 @@
           <w:sz w:val="18"/>
           <w:szCs w:val="18"/>
         </w:rPr>
-        <w:t xml:space="preserve">WHERE ciudad = 'Trujillo' AND categoria = 'Plato' AND monto &gt;= 60</w:t>
+        <w:t xml:space="preserve">WHERE categoria = 'Plato' AND monto &gt;= 50</w:t>
       </w:r>
     </w:p>
     <w:p>
@@ -14994,7 +13513,7 @@
         <w:t xml:space="preserve">Pregunta del analista:</w:t>
       </w:r>
       <w:r>
-        <w:t xml:space="preserve"> ¿Cuáles son las dos ventas de bebida de menor monto?</w:t>
+        <w:t xml:space="preserve"> ¿Cuáles son las dos ventas de menor monto?</w:t>
       </w:r>
     </w:p>
     <w:p>
@@ -15025,7 +13544,7 @@
           <w:sz w:val="18"/>
           <w:szCs w:val="18"/>
         </w:rPr>
-        <w:t xml:space="preserve">consulta = """SELECT producto, ciudad, monto</w:t>
+        <w:t xml:space="preserve">consulta = """SELECT ciudad, producto, monto</w:t>
       </w:r>
     </w:p>
     <w:p>
@@ -15055,7 +13574,7 @@
           <w:sz w:val="18"/>
           <w:szCs w:val="18"/>
         </w:rPr>
-        <w:t xml:space="preserve">WHERE categoria = 'Bebida'</w:t>
+        <w:t xml:space="preserve">ORDER BY monto ASC</w:t>
       </w:r>
     </w:p>
     <w:p>
@@ -15070,14 +13589,14 @@
           <w:sz w:val="18"/>
           <w:szCs w:val="18"/>
         </w:rPr>
-        <w:t xml:space="preserve">ORDER BY monto ASC</w:t>
-      </w:r>
-    </w:p>
-    <w:p>
-      <w:pPr>
-        <w:keepNext/>
+        <w:t xml:space="preserve">LIMIT 2;"""</w:t>
+      </w:r>
+    </w:p>
+    <w:p>
+      <w:pPr>
+        <w:keepNext w:val="false"/>
         <w:shd w:fill="F5F5F5" w:val="clear"/>
-        <w:spacing w:after="0" w:before="0" w:line="240"/>
+        <w:spacing w:after="120" w:before="0" w:line="240"/>
       </w:pPr>
       <w:r>
         <w:rPr>
@@ -15085,21 +13604,6 @@
           <w:sz w:val="18"/>
           <w:szCs w:val="18"/>
         </w:rPr>
-        <w:t xml:space="preserve">LIMIT 2;"""</w:t>
-      </w:r>
-    </w:p>
-    <w:p>
-      <w:pPr>
-        <w:keepNext w:val="false"/>
-        <w:shd w:fill="F5F5F5" w:val="clear"/>
-        <w:spacing w:after="120" w:before="0" w:line="240"/>
-      </w:pPr>
-      <w:r>
-        <w:rPr>
-          <w:rFonts w:ascii="Consolas" w:cs="Consolas" w:eastAsia="Consolas" w:hAnsi="Consolas"/>
-          <w:sz w:val="18"/>
-          <w:szCs w:val="18"/>
-        </w:rPr>
         <w:t xml:space="preserve">conexion.execute(consulta).fetchall()</w:t>
       </w:r>
     </w:p>
@@ -15169,7 +13673,7 @@
         <w:t xml:space="preserve">Pregunta del analista:</w:t>
       </w:r>
       <w:r>
-        <w:t xml:space="preserve"> ¿Qué ventas registraron las sedes de Lima o de Cusco? (Solo las ocho primeras filas.)</w:t>
+        <w:t xml:space="preserve"> ¿Qué ventas registraron las sedes de Lima o de Juliaca?</w:t>
       </w:r>
     </w:p>
     <w:p>
@@ -15230,14 +13734,14 @@
           <w:sz w:val="18"/>
           <w:szCs w:val="18"/>
         </w:rPr>
-        <w:t xml:space="preserve">WHERE ciudad = 'Lima' OR ciudad = 'Cusco'</w:t>
-      </w:r>
-    </w:p>
-    <w:p>
-      <w:pPr>
-        <w:keepNext/>
+        <w:t xml:space="preserve">WHERE ciudad = 'Lima' OR ciudad = 'Juliaca';"""</w:t>
+      </w:r>
+    </w:p>
+    <w:p>
+      <w:pPr>
+        <w:keepNext w:val="false"/>
         <w:shd w:fill="F5F5F5" w:val="clear"/>
-        <w:spacing w:after="0" w:before="0" w:line="240"/>
+        <w:spacing w:after="120" w:before="0" w:line="240"/>
       </w:pPr>
       <w:r>
         <w:rPr>
@@ -15245,21 +13749,6 @@
           <w:sz w:val="18"/>
           <w:szCs w:val="18"/>
         </w:rPr>
-        <w:t xml:space="preserve">LIMIT 8;"""</w:t>
-      </w:r>
-    </w:p>
-    <w:p>
-      <w:pPr>
-        <w:keepNext w:val="false"/>
-        <w:shd w:fill="F5F5F5" w:val="clear"/>
-        <w:spacing w:after="120" w:before="0" w:line="240"/>
-      </w:pPr>
-      <w:r>
-        <w:rPr>
-          <w:rFonts w:ascii="Consolas" w:cs="Consolas" w:eastAsia="Consolas" w:hAnsi="Consolas"/>
-          <w:sz w:val="18"/>
-          <w:szCs w:val="18"/>
-        </w:rPr>
         <w:t xml:space="preserve">conexion.execute(consulta).fetchall()</w:t>
       </w:r>
     </w:p>
@@ -15329,7 +13818,7 @@
         <w:t xml:space="preserve">Pregunta del analista:</w:t>
       </w:r>
       <w:r>
-        <w:t xml:space="preserve"> ¿Cuáles son las tres ventas de mayor monto de todo el periodo?</w:t>
+        <w:t xml:space="preserve"> ¿Qué ventas se pagaron con tarjeta?</w:t>
       </w:r>
     </w:p>
     <w:p>
@@ -15390,22 +13879,7 @@
           <w:sz w:val="18"/>
           <w:szCs w:val="18"/>
         </w:rPr>
-        <w:t xml:space="preserve">ORDER BY monto DESC</w:t>
-      </w:r>
-    </w:p>
-    <w:p>
-      <w:pPr>
-        <w:keepNext/>
-        <w:shd w:fill="F5F5F5" w:val="clear"/>
-        <w:spacing w:after="0" w:before="0" w:line="240"/>
-      </w:pPr>
-      <w:r>
-        <w:rPr>
-          <w:rFonts w:ascii="Consolas" w:cs="Consolas" w:eastAsia="Consolas" w:hAnsi="Consolas"/>
-          <w:sz w:val="18"/>
-          <w:szCs w:val="18"/>
-        </w:rPr>
-        <w:t xml:space="preserve">LIMIT 3;"""</w:t>
+        <w:t xml:space="preserve">WHERE pago_con_tarjeta = 1;"""</w:t>
       </w:r>
     </w:p>
     <w:p>
@@ -15504,7 +13978,7 @@
         <w:t xml:space="preserve">Instrucciones:</w:t>
       </w:r>
       <w:r>
-        <w:t xml:space="preserve"> a partir de las cuatro consultas, redacte el informe breve que entregaría a la administradora. Cite al menos dos cifras observadas y reconozca una limitación de las 72 ventas simuladas.</w:t>
+        <w:t xml:space="preserve"> a partir de las cuatro consultas, redacte el informe breve que entregaría a la administradora. Cite al menos dos cifras observadas y reconozca una limitación de las 5 ventas simuladas.</w:t>
       </w:r>
     </w:p>
     <w:tbl>

</xml_diff>

<commit_message>
Calificado 1: tres tablas básicas con menos columnas
Co-Authored-By: Claude Sonnet 5.5 <noreply@anthropic.com>
Claude-Session: https://claude.ai/code/session_01HWf88gfjbnyHET9WH8GMM1
</commit_message>
<xml_diff>
--- a/laboratorios_fgd/LAB-C1-FGD-2026II-ESTUDIANTE.docx
+++ b/laboratorios_fgd/LAB-C1-FGD-2026II-ESTUDIANTE.docx
@@ -8882,7 +8882,7 @@
           <w:sz w:val="18"/>
           <w:szCs w:val="18"/>
         </w:rPr>
-        <w:t xml:space="preserve">    precio_lista REAL    NOT NULL,</w:t>
+        <w:t xml:space="preserve">    precio_lista REAL    NOT NULL</w:t>
       </w:r>
     </w:p>
     <w:p>
@@ -8897,7 +8897,7 @@
           <w:sz w:val="18"/>
           <w:szCs w:val="18"/>
         </w:rPr>
-        <w:t xml:space="preserve">    activo       INTEGER NOT NULL   -- 1 = sí, 0 = no</w:t>
+        <w:t xml:space="preserve">);</w:t>
       </w:r>
     </w:p>
     <w:p>
@@ -8912,7 +8912,7 @@
           <w:sz w:val="18"/>
           <w:szCs w:val="18"/>
         </w:rPr>
-        <w:t xml:space="preserve">);</w:t>
+        <w:t xml:space="preserve"> </w:t>
       </w:r>
     </w:p>
     <w:p>
@@ -8927,7 +8927,7 @@
           <w:sz w:val="18"/>
           <w:szCs w:val="18"/>
         </w:rPr>
-        <w:t xml:space="preserve"> </w:t>
+        <w:t xml:space="preserve">CREATE TABLE ventas (</w:t>
       </w:r>
     </w:p>
     <w:p>
@@ -8942,7 +8942,7 @@
           <w:sz w:val="18"/>
           <w:szCs w:val="18"/>
         </w:rPr>
-        <w:t xml:space="preserve">CREATE TABLE ventas (</w:t>
+        <w:t xml:space="preserve">    venta_id     INTEGER PRIMARY KEY,</w:t>
       </w:r>
     </w:p>
     <w:p>
@@ -8957,7 +8957,7 @@
           <w:sz w:val="18"/>
           <w:szCs w:val="18"/>
         </w:rPr>
-        <w:t xml:space="preserve">    venta_id         INTEGER PRIMARY KEY,</w:t>
+        <w:t xml:space="preserve">    ciudad       TEXT    NOT NULL,</w:t>
       </w:r>
     </w:p>
     <w:p>
@@ -8972,7 +8972,7 @@
           <w:sz w:val="18"/>
           <w:szCs w:val="18"/>
         </w:rPr>
-        <w:t xml:space="preserve">    ciudad           TEXT    NOT NULL,</w:t>
+        <w:t xml:space="preserve">    producto     TEXT    NOT NULL,</w:t>
       </w:r>
     </w:p>
     <w:p>
@@ -8987,7 +8987,7 @@
           <w:sz w:val="18"/>
           <w:szCs w:val="18"/>
         </w:rPr>
-        <w:t xml:space="preserve">    producto         TEXT    NOT NULL,</w:t>
+        <w:t xml:space="preserve">    unidades     INTEGER NOT NULL,</w:t>
       </w:r>
     </w:p>
     <w:p>
@@ -9002,7 +9002,7 @@
           <w:sz w:val="18"/>
           <w:szCs w:val="18"/>
         </w:rPr>
-        <w:t xml:space="preserve">    categoria        TEXT    NOT NULL,</w:t>
+        <w:t xml:space="preserve">    monto        REAL    NOT NULL,</w:t>
       </w:r>
     </w:p>
     <w:p>
@@ -9017,52 +9017,7 @@
           <w:sz w:val="18"/>
           <w:szCs w:val="18"/>
         </w:rPr>
-        <w:t xml:space="preserve">    unidades         INTEGER NOT NULL,</w:t>
-      </w:r>
-    </w:p>
-    <w:p>
-      <w:pPr>
-        <w:keepNext/>
-        <w:shd w:fill="F5F5F5" w:val="clear"/>
-        <w:spacing w:after="0" w:before="0" w:line="240"/>
-      </w:pPr>
-      <w:r>
-        <w:rPr>
-          <w:rFonts w:ascii="Consolas" w:cs="Consolas" w:eastAsia="Consolas" w:hAnsi="Consolas"/>
-          <w:sz w:val="18"/>
-          <w:szCs w:val="18"/>
-        </w:rPr>
-        <w:t xml:space="preserve">    monto            REAL    NOT NULL,</w:t>
-      </w:r>
-    </w:p>
-    <w:p>
-      <w:pPr>
-        <w:keepNext/>
-        <w:shd w:fill="F5F5F5" w:val="clear"/>
-        <w:spacing w:after="0" w:before="0" w:line="240"/>
-      </w:pPr>
-      <w:r>
-        <w:rPr>
-          <w:rFonts w:ascii="Consolas" w:cs="Consolas" w:eastAsia="Consolas" w:hAnsi="Consolas"/>
-          <w:sz w:val="18"/>
-          <w:szCs w:val="18"/>
-        </w:rPr>
-        <w:t xml:space="preserve">    pago_con_tarjeta INTEGER NOT NULL,  -- 1 = sí, 0 = no</w:t>
-      </w:r>
-    </w:p>
-    <w:p>
-      <w:pPr>
-        <w:keepNext/>
-        <w:shd w:fill="F5F5F5" w:val="clear"/>
-        <w:spacing w:after="0" w:before="0" w:line="240"/>
-      </w:pPr>
-      <w:r>
-        <w:rPr>
-          <w:rFonts w:ascii="Consolas" w:cs="Consolas" w:eastAsia="Consolas" w:hAnsi="Consolas"/>
-          <w:sz w:val="18"/>
-          <w:szCs w:val="18"/>
-        </w:rPr>
-        <w:t xml:space="preserve">    satisfaccion     TEXT               -- Baja, Media o Alta (puede quedar vacía)</w:t>
+        <w:t xml:space="preserve">    satisfaccion TEXT               -- Baja, Media o Alta (puede quedar vacía)</w:t>
       </w:r>
     </w:p>
     <w:p>
@@ -9233,7 +9188,7 @@
           <w:sz w:val="18"/>
           <w:szCs w:val="18"/>
         </w:rPr>
-        <w:t xml:space="preserve">    (1, 'Lomo saltado', 'Plato', 38.0, 1),</w:t>
+        <w:t xml:space="preserve">    (1, 'Lomo saltado', 'Plato', 38.0),</w:t>
       </w:r>
     </w:p>
     <w:p>
@@ -9248,7 +9203,7 @@
           <w:sz w:val="18"/>
           <w:szCs w:val="18"/>
         </w:rPr>
-        <w:t xml:space="preserve">    (2, 'Ceviche', 'Plato', 42.0, 1),</w:t>
+        <w:t xml:space="preserve">    (2, 'Ceviche', 'Plato', 42.0),</w:t>
       </w:r>
     </w:p>
     <w:p>
@@ -9263,7 +9218,7 @@
           <w:sz w:val="18"/>
           <w:szCs w:val="18"/>
         </w:rPr>
-        <w:t xml:space="preserve">    (3, 'Chicha morada', 'Bebida', 9.0, 1),</w:t>
+        <w:t xml:space="preserve">    (3, 'Chicha morada', 'Bebida', 9.0),</w:t>
       </w:r>
     </w:p>
     <w:p>
@@ -9278,7 +9233,7 @@
           <w:sz w:val="18"/>
           <w:szCs w:val="18"/>
         </w:rPr>
-        <w:t xml:space="preserve">    (4, 'Limonada', 'Bebida', 8.0, 1),</w:t>
+        <w:t xml:space="preserve">    (4, 'Limonada', 'Bebida', 8.0),</w:t>
       </w:r>
     </w:p>
     <w:p>
@@ -9293,7 +9248,7 @@
           <w:sz w:val="18"/>
           <w:szCs w:val="18"/>
         </w:rPr>
-        <w:t xml:space="preserve">    (5, 'Suspiro limeño', 'Postre', 15.0, 0);</w:t>
+        <w:t xml:space="preserve">    (5, 'Suspiro limeño', 'Postre', 15.0);</w:t>
       </w:r>
     </w:p>
     <w:p>
@@ -9338,7 +9293,7 @@
           <w:sz w:val="18"/>
           <w:szCs w:val="18"/>
         </w:rPr>
-        <w:t xml:space="preserve">    (1, 'Lima', 'Lomo saltado', 'Plato', 2, 76.0, 1, 'Alta'),</w:t>
+        <w:t xml:space="preserve">    (1, 'Lima', 'Lomo saltado', 2, 76.0, 'Alta'),</w:t>
       </w:r>
     </w:p>
     <w:p>
@@ -9353,7 +9308,7 @@
           <w:sz w:val="18"/>
           <w:szCs w:val="18"/>
         </w:rPr>
-        <w:t xml:space="preserve">    (2, 'Cusco', 'Ceviche', 'Plato', 3, 126.0, 1, 'Media'),</w:t>
+        <w:t xml:space="preserve">    (2, 'Cusco', 'Ceviche', 3, 126.0, 'Media'),</w:t>
       </w:r>
     </w:p>
     <w:p>
@@ -9368,7 +9323,7 @@
           <w:sz w:val="18"/>
           <w:szCs w:val="18"/>
         </w:rPr>
-        <w:t xml:space="preserve">    (3, 'Juliaca', 'Chicha morada', 'Bebida', 2, 18.0, 0, 'Baja'),</w:t>
+        <w:t xml:space="preserve">    (3, 'Juliaca', 'Chicha morada', 2, 18.0, 'Baja'),</w:t>
       </w:r>
     </w:p>
     <w:p>
@@ -9383,7 +9338,7 @@
           <w:sz w:val="18"/>
           <w:szCs w:val="18"/>
         </w:rPr>
-        <w:t xml:space="preserve">    (4, 'Lima', 'Limonada', 'Bebida', 3, 24.0, 0, NULL),</w:t>
+        <w:t xml:space="preserve">    (4, 'Lima', 'Limonada', 3, 24.0, NULL),</w:t>
       </w:r>
     </w:p>
     <w:p>
@@ -9398,7 +9353,7 @@
           <w:sz w:val="18"/>
           <w:szCs w:val="18"/>
         </w:rPr>
-        <w:t xml:space="preserve">    (5, 'Juliaca', 'Lomo saltado', 'Plato', 1, 38.0, 0, 'Alta');</w:t>
+        <w:t xml:space="preserve">    (5, 'Juliaca', 'Lomo saltado', 1, 38.0, 'Alta');</w:t>
       </w:r>
     </w:p>
     <w:p>
@@ -11153,169 +11108,6 @@
           </w:p>
         </w:tc>
       </w:tr>
-      <w:tr>
-        <w:trPr>
-          <w:cantSplit/>
-          <w:trHeight w:val="460" w:hRule="atLeast"/>
-        </w:trPr>
-        <w:tc>
-          <w:tcPr>
-            <w:tcW w:type="dxa" w:w="2100"/>
-            <w:tcBorders>
-              <w:top w:val="single" w:color="auto" w:sz="4"/>
-              <w:left w:val="single" w:color="auto" w:sz="4"/>
-              <w:bottom w:val="single" w:color="auto" w:sz="4"/>
-              <w:right w:val="single" w:color="auto" w:sz="4"/>
-            </w:tcBorders>
-            <w:shd w:fill="F7F9FB" w:color="auto" w:val="clear"/>
-            <w:tcMar>
-              <w:top w:type="dxa" w:w="80"/>
-              <w:left w:type="dxa" w:w="90"/>
-              <w:bottom w:type="dxa" w:w="80"/>
-              <w:right w:type="dxa" w:w="90"/>
-            </w:tcMar>
-            <w:vAlign w:val="top"/>
-          </w:tcPr>
-          <w:p>
-            <w:pPr>
-              <w:spacing w:after="0" w:line="240"/>
-            </w:pPr>
-            <w:r>
-              <w:rPr>
-                <w:b/>
-                <w:bCs/>
-                <w:sz w:val="22"/>
-                <w:szCs w:val="22"/>
-              </w:rPr>
-              <w:t xml:space="preserve">activo</w:t>
-            </w:r>
-          </w:p>
-        </w:tc>
-        <w:tc>
-          <w:tcPr>
-            <w:tcW w:type="dxa" w:w="1500"/>
-            <w:tcBorders>
-              <w:top w:val="single" w:color="auto" w:sz="4"/>
-              <w:left w:val="single" w:color="auto" w:sz="4"/>
-              <w:bottom w:val="single" w:color="auto" w:sz="4"/>
-              <w:right w:val="single" w:color="auto" w:sz="4"/>
-            </w:tcBorders>
-            <w:shd w:fill="F7F9FB" w:color="auto" w:val="clear"/>
-            <w:tcMar>
-              <w:top w:type="dxa" w:w="80"/>
-              <w:left w:type="dxa" w:w="90"/>
-              <w:bottom w:type="dxa" w:w="80"/>
-              <w:right w:type="dxa" w:w="90"/>
-            </w:tcMar>
-            <w:vAlign w:val="top"/>
-          </w:tcPr>
-          <w:p>
-            <w:pPr>
-              <w:spacing w:after="0" w:line="240"/>
-            </w:pPr>
-            <w:r>
-              <w:rPr>
-                <w:sz w:val="22"/>
-                <w:szCs w:val="22"/>
-              </w:rPr>
-              <w:t xml:space="preserve"> </w:t>
-            </w:r>
-          </w:p>
-        </w:tc>
-        <w:tc>
-          <w:tcPr>
-            <w:tcW w:type="dxa" w:w="1900"/>
-            <w:tcBorders>
-              <w:top w:val="single" w:color="auto" w:sz="4"/>
-              <w:left w:val="single" w:color="auto" w:sz="4"/>
-              <w:bottom w:val="single" w:color="auto" w:sz="4"/>
-              <w:right w:val="single" w:color="auto" w:sz="4"/>
-            </w:tcBorders>
-            <w:shd w:fill="F7F9FB" w:color="auto" w:val="clear"/>
-            <w:tcMar>
-              <w:top w:type="dxa" w:w="80"/>
-              <w:left w:type="dxa" w:w="90"/>
-              <w:bottom w:type="dxa" w:w="80"/>
-              <w:right w:type="dxa" w:w="90"/>
-            </w:tcMar>
-            <w:vAlign w:val="top"/>
-          </w:tcPr>
-          <w:p>
-            <w:pPr>
-              <w:spacing w:after="0" w:line="240"/>
-            </w:pPr>
-            <w:r>
-              <w:rPr>
-                <w:sz w:val="22"/>
-                <w:szCs w:val="22"/>
-              </w:rPr>
-              <w:t xml:space="preserve"> </w:t>
-            </w:r>
-          </w:p>
-        </w:tc>
-        <w:tc>
-          <w:tcPr>
-            <w:tcW w:type="dxa" w:w="1800"/>
-            <w:tcBorders>
-              <w:top w:val="single" w:color="auto" w:sz="4"/>
-              <w:left w:val="single" w:color="auto" w:sz="4"/>
-              <w:bottom w:val="single" w:color="auto" w:sz="4"/>
-              <w:right w:val="single" w:color="auto" w:sz="4"/>
-            </w:tcBorders>
-            <w:shd w:fill="F7F9FB" w:color="auto" w:val="clear"/>
-            <w:tcMar>
-              <w:top w:type="dxa" w:w="80"/>
-              <w:left w:type="dxa" w:w="90"/>
-              <w:bottom w:type="dxa" w:w="80"/>
-              <w:right w:type="dxa" w:w="90"/>
-            </w:tcMar>
-            <w:vAlign w:val="top"/>
-          </w:tcPr>
-          <w:p>
-            <w:pPr>
-              <w:spacing w:after="0" w:line="240"/>
-            </w:pPr>
-            <w:r>
-              <w:rPr>
-                <w:sz w:val="22"/>
-                <w:szCs w:val="22"/>
-              </w:rPr>
-              <w:t xml:space="preserve"> </w:t>
-            </w:r>
-          </w:p>
-        </w:tc>
-        <w:tc>
-          <w:tcPr>
-            <w:tcW w:type="dxa" w:w="2338"/>
-            <w:tcBorders>
-              <w:top w:val="single" w:color="auto" w:sz="4"/>
-              <w:left w:val="single" w:color="auto" w:sz="4"/>
-              <w:bottom w:val="single" w:color="auto" w:sz="4"/>
-              <w:right w:val="single" w:color="auto" w:sz="4"/>
-            </w:tcBorders>
-            <w:shd w:fill="F7F9FB" w:color="auto" w:val="clear"/>
-            <w:tcMar>
-              <w:top w:type="dxa" w:w="80"/>
-              <w:left w:type="dxa" w:w="90"/>
-              <w:bottom w:type="dxa" w:w="80"/>
-              <w:right w:type="dxa" w:w="90"/>
-            </w:tcMar>
-            <w:vAlign w:val="top"/>
-          </w:tcPr>
-          <w:p>
-            <w:pPr>
-              <w:spacing w:after="0" w:line="240"/>
-            </w:pPr>
-            <w:r>
-              <w:rPr>
-                <w:sz w:val="22"/>
-                <w:szCs w:val="22"/>
-              </w:rPr>
-              <w:t xml:space="preserve"> </w:t>
-            </w:r>
-          </w:p>
-        </w:tc>
-      </w:tr>
     </w:tbl>
     <w:p>
       <w:pPr>
@@ -12052,7 +11844,7 @@
                 <w:sz w:val="22"/>
                 <w:szCs w:val="22"/>
               </w:rPr>
-              <w:t xml:space="preserve">categoria</w:t>
+              <w:t xml:space="preserve">unidades</w:t>
             </w:r>
           </w:p>
         </w:tc>
@@ -12215,333 +12007,7 @@
                 <w:sz w:val="22"/>
                 <w:szCs w:val="22"/>
               </w:rPr>
-              <w:t xml:space="preserve">unidades</w:t>
-            </w:r>
-          </w:p>
-        </w:tc>
-        <w:tc>
-          <w:tcPr>
-            <w:tcW w:type="dxa" w:w="1500"/>
-            <w:tcBorders>
-              <w:top w:val="single" w:color="auto" w:sz="4"/>
-              <w:left w:val="single" w:color="auto" w:sz="4"/>
-              <w:bottom w:val="single" w:color="auto" w:sz="4"/>
-              <w:right w:val="single" w:color="auto" w:sz="4"/>
-            </w:tcBorders>
-            <w:shd w:fill="F7F9FB" w:color="auto" w:val="clear"/>
-            <w:tcMar>
-              <w:top w:type="dxa" w:w="80"/>
-              <w:left w:type="dxa" w:w="90"/>
-              <w:bottom w:type="dxa" w:w="80"/>
-              <w:right w:type="dxa" w:w="90"/>
-            </w:tcMar>
-            <w:vAlign w:val="top"/>
-          </w:tcPr>
-          <w:p>
-            <w:pPr>
-              <w:spacing w:after="0" w:line="240"/>
-            </w:pPr>
-            <w:r>
-              <w:rPr>
-                <w:sz w:val="22"/>
-                <w:szCs w:val="22"/>
-              </w:rPr>
-              <w:t xml:space="preserve"> </w:t>
-            </w:r>
-          </w:p>
-        </w:tc>
-        <w:tc>
-          <w:tcPr>
-            <w:tcW w:type="dxa" w:w="1900"/>
-            <w:tcBorders>
-              <w:top w:val="single" w:color="auto" w:sz="4"/>
-              <w:left w:val="single" w:color="auto" w:sz="4"/>
-              <w:bottom w:val="single" w:color="auto" w:sz="4"/>
-              <w:right w:val="single" w:color="auto" w:sz="4"/>
-            </w:tcBorders>
-            <w:shd w:fill="F7F9FB" w:color="auto" w:val="clear"/>
-            <w:tcMar>
-              <w:top w:type="dxa" w:w="80"/>
-              <w:left w:type="dxa" w:w="90"/>
-              <w:bottom w:type="dxa" w:w="80"/>
-              <w:right w:type="dxa" w:w="90"/>
-            </w:tcMar>
-            <w:vAlign w:val="top"/>
-          </w:tcPr>
-          <w:p>
-            <w:pPr>
-              <w:spacing w:after="0" w:line="240"/>
-            </w:pPr>
-            <w:r>
-              <w:rPr>
-                <w:sz w:val="22"/>
-                <w:szCs w:val="22"/>
-              </w:rPr>
-              <w:t xml:space="preserve"> </w:t>
-            </w:r>
-          </w:p>
-        </w:tc>
-        <w:tc>
-          <w:tcPr>
-            <w:tcW w:type="dxa" w:w="1800"/>
-            <w:tcBorders>
-              <w:top w:val="single" w:color="auto" w:sz="4"/>
-              <w:left w:val="single" w:color="auto" w:sz="4"/>
-              <w:bottom w:val="single" w:color="auto" w:sz="4"/>
-              <w:right w:val="single" w:color="auto" w:sz="4"/>
-            </w:tcBorders>
-            <w:shd w:fill="F7F9FB" w:color="auto" w:val="clear"/>
-            <w:tcMar>
-              <w:top w:type="dxa" w:w="80"/>
-              <w:left w:type="dxa" w:w="90"/>
-              <w:bottom w:type="dxa" w:w="80"/>
-              <w:right w:type="dxa" w:w="90"/>
-            </w:tcMar>
-            <w:vAlign w:val="top"/>
-          </w:tcPr>
-          <w:p>
-            <w:pPr>
-              <w:spacing w:after="0" w:line="240"/>
-            </w:pPr>
-            <w:r>
-              <w:rPr>
-                <w:sz w:val="22"/>
-                <w:szCs w:val="22"/>
-              </w:rPr>
-              <w:t xml:space="preserve"> </w:t>
-            </w:r>
-          </w:p>
-        </w:tc>
-        <w:tc>
-          <w:tcPr>
-            <w:tcW w:type="dxa" w:w="2338"/>
-            <w:tcBorders>
-              <w:top w:val="single" w:color="auto" w:sz="4"/>
-              <w:left w:val="single" w:color="auto" w:sz="4"/>
-              <w:bottom w:val="single" w:color="auto" w:sz="4"/>
-              <w:right w:val="single" w:color="auto" w:sz="4"/>
-            </w:tcBorders>
-            <w:shd w:fill="F7F9FB" w:color="auto" w:val="clear"/>
-            <w:tcMar>
-              <w:top w:type="dxa" w:w="80"/>
-              <w:left w:type="dxa" w:w="90"/>
-              <w:bottom w:type="dxa" w:w="80"/>
-              <w:right w:type="dxa" w:w="90"/>
-            </w:tcMar>
-            <w:vAlign w:val="top"/>
-          </w:tcPr>
-          <w:p>
-            <w:pPr>
-              <w:spacing w:after="0" w:line="240"/>
-            </w:pPr>
-            <w:r>
-              <w:rPr>
-                <w:sz w:val="22"/>
-                <w:szCs w:val="22"/>
-              </w:rPr>
-              <w:t xml:space="preserve"> </w:t>
-            </w:r>
-          </w:p>
-        </w:tc>
-      </w:tr>
-      <w:tr>
-        <w:trPr>
-          <w:cantSplit/>
-          <w:trHeight w:val="460" w:hRule="atLeast"/>
-        </w:trPr>
-        <w:tc>
-          <w:tcPr>
-            <w:tcW w:type="dxa" w:w="2100"/>
-            <w:tcBorders>
-              <w:top w:val="single" w:color="auto" w:sz="4"/>
-              <w:left w:val="single" w:color="auto" w:sz="4"/>
-              <w:bottom w:val="single" w:color="auto" w:sz="4"/>
-              <w:right w:val="single" w:color="auto" w:sz="4"/>
-            </w:tcBorders>
-            <w:shd w:fill="FFFFFF" w:color="auto" w:val="clear"/>
-            <w:tcMar>
-              <w:top w:type="dxa" w:w="80"/>
-              <w:left w:type="dxa" w:w="90"/>
-              <w:bottom w:type="dxa" w:w="80"/>
-              <w:right w:type="dxa" w:w="90"/>
-            </w:tcMar>
-            <w:vAlign w:val="top"/>
-          </w:tcPr>
-          <w:p>
-            <w:pPr>
-              <w:spacing w:after="0" w:line="240"/>
-            </w:pPr>
-            <w:r>
-              <w:rPr>
-                <w:b/>
-                <w:bCs/>
-                <w:sz w:val="22"/>
-                <w:szCs w:val="22"/>
-              </w:rPr>
               <w:t xml:space="preserve">monto</w:t>
-            </w:r>
-          </w:p>
-        </w:tc>
-        <w:tc>
-          <w:tcPr>
-            <w:tcW w:type="dxa" w:w="1500"/>
-            <w:tcBorders>
-              <w:top w:val="single" w:color="auto" w:sz="4"/>
-              <w:left w:val="single" w:color="auto" w:sz="4"/>
-              <w:bottom w:val="single" w:color="auto" w:sz="4"/>
-              <w:right w:val="single" w:color="auto" w:sz="4"/>
-            </w:tcBorders>
-            <w:shd w:fill="FFFFFF" w:color="auto" w:val="clear"/>
-            <w:tcMar>
-              <w:top w:type="dxa" w:w="80"/>
-              <w:left w:type="dxa" w:w="90"/>
-              <w:bottom w:type="dxa" w:w="80"/>
-              <w:right w:type="dxa" w:w="90"/>
-            </w:tcMar>
-            <w:vAlign w:val="top"/>
-          </w:tcPr>
-          <w:p>
-            <w:pPr>
-              <w:spacing w:after="0" w:line="240"/>
-            </w:pPr>
-            <w:r>
-              <w:rPr>
-                <w:sz w:val="22"/>
-                <w:szCs w:val="22"/>
-              </w:rPr>
-              <w:t xml:space="preserve"> </w:t>
-            </w:r>
-          </w:p>
-        </w:tc>
-        <w:tc>
-          <w:tcPr>
-            <w:tcW w:type="dxa" w:w="1900"/>
-            <w:tcBorders>
-              <w:top w:val="single" w:color="auto" w:sz="4"/>
-              <w:left w:val="single" w:color="auto" w:sz="4"/>
-              <w:bottom w:val="single" w:color="auto" w:sz="4"/>
-              <w:right w:val="single" w:color="auto" w:sz="4"/>
-            </w:tcBorders>
-            <w:shd w:fill="FFFFFF" w:color="auto" w:val="clear"/>
-            <w:tcMar>
-              <w:top w:type="dxa" w:w="80"/>
-              <w:left w:type="dxa" w:w="90"/>
-              <w:bottom w:type="dxa" w:w="80"/>
-              <w:right w:type="dxa" w:w="90"/>
-            </w:tcMar>
-            <w:vAlign w:val="top"/>
-          </w:tcPr>
-          <w:p>
-            <w:pPr>
-              <w:spacing w:after="0" w:line="240"/>
-            </w:pPr>
-            <w:r>
-              <w:rPr>
-                <w:sz w:val="22"/>
-                <w:szCs w:val="22"/>
-              </w:rPr>
-              <w:t xml:space="preserve"> </w:t>
-            </w:r>
-          </w:p>
-        </w:tc>
-        <w:tc>
-          <w:tcPr>
-            <w:tcW w:type="dxa" w:w="1800"/>
-            <w:tcBorders>
-              <w:top w:val="single" w:color="auto" w:sz="4"/>
-              <w:left w:val="single" w:color="auto" w:sz="4"/>
-              <w:bottom w:val="single" w:color="auto" w:sz="4"/>
-              <w:right w:val="single" w:color="auto" w:sz="4"/>
-            </w:tcBorders>
-            <w:shd w:fill="FFFFFF" w:color="auto" w:val="clear"/>
-            <w:tcMar>
-              <w:top w:type="dxa" w:w="80"/>
-              <w:left w:type="dxa" w:w="90"/>
-              <w:bottom w:type="dxa" w:w="80"/>
-              <w:right w:type="dxa" w:w="90"/>
-            </w:tcMar>
-            <w:vAlign w:val="top"/>
-          </w:tcPr>
-          <w:p>
-            <w:pPr>
-              <w:spacing w:after="0" w:line="240"/>
-            </w:pPr>
-            <w:r>
-              <w:rPr>
-                <w:sz w:val="22"/>
-                <w:szCs w:val="22"/>
-              </w:rPr>
-              <w:t xml:space="preserve"> </w:t>
-            </w:r>
-          </w:p>
-        </w:tc>
-        <w:tc>
-          <w:tcPr>
-            <w:tcW w:type="dxa" w:w="2338"/>
-            <w:tcBorders>
-              <w:top w:val="single" w:color="auto" w:sz="4"/>
-              <w:left w:val="single" w:color="auto" w:sz="4"/>
-              <w:bottom w:val="single" w:color="auto" w:sz="4"/>
-              <w:right w:val="single" w:color="auto" w:sz="4"/>
-            </w:tcBorders>
-            <w:shd w:fill="FFFFFF" w:color="auto" w:val="clear"/>
-            <w:tcMar>
-              <w:top w:type="dxa" w:w="80"/>
-              <w:left w:type="dxa" w:w="90"/>
-              <w:bottom w:type="dxa" w:w="80"/>
-              <w:right w:type="dxa" w:w="90"/>
-            </w:tcMar>
-            <w:vAlign w:val="top"/>
-          </w:tcPr>
-          <w:p>
-            <w:pPr>
-              <w:spacing w:after="0" w:line="240"/>
-            </w:pPr>
-            <w:r>
-              <w:rPr>
-                <w:sz w:val="22"/>
-                <w:szCs w:val="22"/>
-              </w:rPr>
-              <w:t xml:space="preserve"> </w:t>
-            </w:r>
-          </w:p>
-        </w:tc>
-      </w:tr>
-      <w:tr>
-        <w:trPr>
-          <w:cantSplit/>
-          <w:trHeight w:val="460" w:hRule="atLeast"/>
-        </w:trPr>
-        <w:tc>
-          <w:tcPr>
-            <w:tcW w:type="dxa" w:w="2100"/>
-            <w:tcBorders>
-              <w:top w:val="single" w:color="auto" w:sz="4"/>
-              <w:left w:val="single" w:color="auto" w:sz="4"/>
-              <w:bottom w:val="single" w:color="auto" w:sz="4"/>
-              <w:right w:val="single" w:color="auto" w:sz="4"/>
-            </w:tcBorders>
-            <w:shd w:fill="F7F9FB" w:color="auto" w:val="clear"/>
-            <w:tcMar>
-              <w:top w:type="dxa" w:w="80"/>
-              <w:left w:type="dxa" w:w="90"/>
-              <w:bottom w:type="dxa" w:w="80"/>
-              <w:right w:type="dxa" w:w="90"/>
-            </w:tcMar>
-            <w:vAlign w:val="top"/>
-          </w:tcPr>
-          <w:p>
-            <w:pPr>
-              <w:spacing w:after="0" w:line="240"/>
-            </w:pPr>
-            <w:r>
-              <w:rPr>
-                <w:b/>
-                <w:bCs/>
-                <w:sz w:val="22"/>
-                <w:szCs w:val="22"/>
-              </w:rPr>
-              <w:t xml:space="preserve">pago_con_tarjeta</w:t>
             </w:r>
           </w:p>
         </w:tc>
@@ -13125,7 +12591,7 @@
                 <w:sz w:val="22"/>
                 <w:szCs w:val="22"/>
               </w:rPr>
-              <w:t xml:space="preserve">¿Cómo se guarda un dato booleano en SQLite? Cite dos columnas booleanas de la base.</w:t>
+              <w:t xml:space="preserve">¿Cómo se guarda un dato booleano en SQLite? Cite la columna booleana de la base y diga qué significan el 1 y el 0.</w:t>
             </w:r>
           </w:p>
         </w:tc>
@@ -13353,7 +12819,7 @@
         <w:t xml:space="preserve">Pregunta del analista:</w:t>
       </w:r>
       <w:r>
-        <w:t xml:space="preserve"> ¿Qué ventas de la categoría Plato fueron de S/ 50 o más? Muéstrelas de mayor a menor.</w:t>
+        <w:t xml:space="preserve"> ¿Qué ventas fueron de S/ 50 o más? Muéstrelas de mayor a menor.</w:t>
       </w:r>
     </w:p>
     <w:p>
@@ -13414,7 +12880,7 @@
           <w:sz w:val="18"/>
           <w:szCs w:val="18"/>
         </w:rPr>
-        <w:t xml:space="preserve">WHERE categoria = 'Plato' AND monto &gt;= 50</w:t>
+        <w:t xml:space="preserve">WHERE monto &gt;= 50</w:t>
       </w:r>
     </w:p>
     <w:p>
@@ -13818,7 +13284,7 @@
         <w:t xml:space="preserve">Pregunta del analista:</w:t>
       </w:r>
       <w:r>
-        <w:t xml:space="preserve"> ¿Qué ventas se pagaron con tarjeta?</w:t>
+        <w:t xml:space="preserve"> ¿Cuáles sedes son propias de El Buen Sabor? (Un 1 en es_propia significa que sí.)</w:t>
       </w:r>
     </w:p>
     <w:p>
@@ -13849,7 +13315,7 @@
           <w:sz w:val="18"/>
           <w:szCs w:val="18"/>
         </w:rPr>
-        <w:t xml:space="preserve">consulta = """SELECT ciudad, producto, monto</w:t>
+        <w:t xml:space="preserve">consulta = """SELECT ciudad</w:t>
       </w:r>
     </w:p>
     <w:p>
@@ -13864,7 +13330,7 @@
           <w:sz w:val="18"/>
           <w:szCs w:val="18"/>
         </w:rPr>
-        <w:t xml:space="preserve">FROM ventas</w:t>
+        <w:t xml:space="preserve">FROM sedes</w:t>
       </w:r>
     </w:p>
     <w:p>
@@ -13879,7 +13345,7 @@
           <w:sz w:val="18"/>
           <w:szCs w:val="18"/>
         </w:rPr>
-        <w:t xml:space="preserve">WHERE pago_con_tarjeta = 1;"""</w:t>
+        <w:t xml:space="preserve">WHERE es_propia = 1;"""</w:t>
       </w:r>
     </w:p>
     <w:p>
@@ -16907,7 +16373,7 @@
                 <w:sz w:val="22"/>
                 <w:szCs w:val="22"/>
               </w:rPr>
-              <w:t xml:space="preserve">Identifica correctamente la clave primaria, el tipo de dato SQLite, las columnas booleanas y el tipo de variable de las tres tablas, y explica con sus palabras qué representa una fila y qué significa un valor vacío (None).</w:t>
+              <w:t xml:space="preserve">Identifica correctamente la clave primaria, el tipo de dato SQLite, la columna booleana y el tipo de variable de las tres tablas, y explica con sus palabras qué representa una fila y qué significa un valor vacío (None).</w:t>
             </w:r>
           </w:p>
         </w:tc>

</xml_diff>